<commit_message>
Unify lexical scope and report profiles
</commit_message>
<xml_diff>
--- a/docs/VerseVAD_Values_and_Terminology_Guide.docx
+++ b/docs/VerseVAD_Values_and_Terminology_Guide.docx
@@ -71,7 +71,7 @@
           <w:color w:val="66727C"/>
           <w:sz w:val="21"/>
         </w:rPr>
-        <w:t xml:space="preserve"> August 2, 2026</w:t>
+        <w:t xml:space="preserve"> August 7, 2026</w:t>
       </w:r>
       <w:r>
         <w:rPr>
@@ -278,7 +278,7 @@
           <w:rFonts w:ascii="Calibri" w:hAnsi="Calibri"/>
           <w:sz w:val="22"/>
         </w:rPr>
-        <w:t>Stopwords and the two VAD views</w:t>
+        <w:t>Global lexical scopes</w:t>
       </w:r>
     </w:p>
     <w:p>
@@ -332,7 +332,7 @@
           <w:rFonts w:ascii="Calibri" w:hAnsi="Calibri"/>
           <w:sz w:val="22"/>
         </w:rPr>
-        <w:t>Stopword sensitivity</w:t>
+        <w:t>Comparing report profiles</w:t>
       </w:r>
     </w:p>
     <w:p>
@@ -857,14 +857,14 @@
           <w:b/>
           <w:sz w:val="22"/>
         </w:rPr>
-        <w:t>Choose one analysis view.</w:t>
-      </w:r>
-      <w:r>
-        <w:rPr>
-          <w:rFonts w:ascii="Calibri" w:hAnsi="Calibri"/>
-          <w:sz w:val="22"/>
-        </w:rPr>
-        <w:t xml:space="preserve"> Compare all matched observations with stopwords excluded; do not merge them.</w:t>
+        <w:t>Choose one lexical scope.</w:t>
+      </w:r>
+      <w:r>
+        <w:rPr>
+          <w:rFonts w:ascii="Calibri" w:hAnsi="Calibri"/>
+          <w:sz w:val="22"/>
+        </w:rPr>
+        <w:t xml:space="preserve"> All lexical tokens, stopword-excluded, and content words only answer different questions; do not merge them.</w:t>
       </w:r>
     </w:p>
     <w:p>
@@ -1018,7 +1018,7 @@
           <w:color w:val="193247"/>
           <w:sz w:val="22"/>
         </w:rPr>
-        <w:t xml:space="preserve"> is incomplete without the lexicon, scale, analysis view, weighting, matched count, coverage, and unit of analysis.</w:t>
+        <w:t xml:space="preserve"> is incomplete without the lexicon, scale, lexical scope, weighting, matched count, coverage, and unit of analysis.</w:t>
       </w:r>
     </w:p>
     <w:p>
@@ -2471,7 +2471,7 @@
           <w:rFonts w:ascii="Calibri" w:hAnsi="Calibri"/>
           <w:sz w:val="22"/>
         </w:rPr>
-        <w:t>A work-level VAD mean is the arithmetic mean of included lexicon ratings under a declared matching policy, analysis view, and weighting. It describes the center of those matched ratings. It does not summarize words that did not match, and it does not assign unmatched words a neutral value.</w:t>
+        <w:t>A work-level VAD mean is the arithmetic mean of included lexicon ratings under a declared matching policy, lexical scope, and weighting. It describes the center of those matched ratings. It does not summarize words that did not match, and it does not assign unmatched words a neutral value.</w:t>
       </w:r>
     </w:p>
     <w:p>
@@ -4549,7 +4549,7 @@
           <w:rFonts w:ascii="Calibri" w:hAnsi="Calibri"/>
           <w:sz w:val="22"/>
         </w:rPr>
-        <w:t xml:space="preserve">. The optional </w:t>
+        <w:t xml:space="preserve">. The global </w:t>
       </w:r>
       <w:r>
         <w:rPr>
@@ -4557,14 +4557,14 @@
           <w:b/>
           <w:sz w:val="22"/>
         </w:rPr>
-        <w:t>AoA content words only</w:t>
-      </w:r>
-      <w:r>
-        <w:rPr>
-          <w:rFonts w:ascii="Calibri" w:hAnsi="Calibri"/>
-          <w:sz w:val="22"/>
-        </w:rPr>
-        <w:t xml:space="preserve"> scope therefore remains meaningful and off by default. It uses the poem occurrence's contextual model tag and includes only </w:t>
+        <w:t>Content words only</w:t>
+      </w:r>
+      <w:r>
+        <w:rPr>
+          <w:rFonts w:ascii="Calibri" w:hAnsi="Calibri"/>
+          <w:sz w:val="22"/>
+        </w:rPr>
+        <w:t xml:space="preserve"> scope therefore remains meaningful. It uses the poem occurrence's contextual model tag and includes only </w:t>
       </w:r>
       <w:r>
         <w:rPr>
@@ -6337,7 +6337,7 @@
           <w:rFonts w:ascii="Calibri" w:hAnsi="Calibri"/>
           <w:sz w:val="22"/>
         </w:rPr>
-        <w:t>PoetryID is a dependent interpretation layer over a completed normalized VAD summary. It does not tokenize the poem, load a VAD lexicon, match words, or calculate VAD again. Every result names its exact VAD source, all-matched or stopword-excluded view, token/type weighting, thresholds, and upstream analysis.</w:t>
+        <w:t>PoetryID is a dependent interpretation layer over a completed normalized VAD summary. It does not tokenize the poem, load a VAD lexicon, match words, or calculate VAD again. Every result names its exact VAD source, lexical scope, aggregation weighting, thresholds, and upstream analysis.</w:t>
       </w:r>
     </w:p>
     <w:p>
@@ -8811,7 +8811,7 @@
           <w:rFonts w:ascii="Calibri" w:hAnsi="Calibri"/>
           <w:sz w:val="22"/>
         </w:rPr>
-        <w:t xml:space="preserve">The optional Frequency and AoA settings </w:t>
+        <w:t xml:space="preserve">The global </w:t>
       </w:r>
       <w:r>
         <w:rPr>
@@ -8826,7 +8826,7 @@
           <w:rFonts w:ascii="Calibri" w:hAnsi="Calibri"/>
           <w:sz w:val="22"/>
         </w:rPr>
-        <w:t xml:space="preserve"> use a narrower rule than this broad display. They include exact tags </w:t>
+        <w:t xml:space="preserve"> report scope uses a narrower rule than this broad display. It includes exact tags </w:t>
       </w:r>
       <w:r>
         <w:rPr>
@@ -8916,7 +8916,7 @@
           <w:rFonts w:ascii="Calibri" w:hAnsi="Calibri"/>
           <w:sz w:val="22"/>
         </w:rPr>
-        <w:t xml:space="preserve"> are not automatically included. The two module settings are recorded separately. Always report which scope was used.</w:t>
+        <w:t xml:space="preserve"> are not automatically included. Always report which scope was used.</w:t>
       </w:r>
     </w:p>
     <w:p>
@@ -8941,7 +8941,7 @@
           <w:rFonts w:ascii="Calibri" w:hAnsi="Calibri"/>
           <w:sz w:val="22"/>
         </w:rPr>
-        <w:t>In one-text results, the Language Profile can add VAD evidence to the broad POS groups without changing the grammatical count/share denominator. Results remain separate for every VAD source and for the all-matched and stopword- excluded views.</w:t>
+        <w:t>In one-text results, the Language Profile can add VAD evidence to the broad POS groups without changing the grammatical count/share denominator. Results remain separate for every VAD source and selected global lexical scope.</w:t>
       </w:r>
     </w:p>
     <w:p>
@@ -8984,7 +8984,7 @@
           <w:rFonts w:ascii="Calibri" w:hAnsi="Calibri"/>
           <w:sz w:val="22"/>
         </w:rPr>
-        <w:t xml:space="preserve"> counts each distinct matched lexicon entry once within that source, view, and group. Repetition can therefore make the two means differ. Both are normative lexical VAD means, not measurements of the emotion of the grammatical category or poem.</w:t>
+        <w:t xml:space="preserve"> counts each distinct matched lexicon entry once within that source, scope, and group. Repetition can therefore make the two means differ. Both are normative lexical VAD means, not measurements of the emotion of the grammatical category or poem.</w:t>
       </w:r>
     </w:p>
     <w:p>
@@ -9402,7 +9402,7 @@
           <w:rFonts w:ascii="Calibri" w:hAnsi="Calibri"/>
           <w:sz w:val="22"/>
         </w:rPr>
-        <w:t>8. Stopwords and the Two VAD Views</w:t>
+        <w:t>8. Global Lexical Scopes</w:t>
       </w:r>
     </w:p>
     <w:p>
@@ -9442,7 +9442,7 @@
           <w:rFonts w:ascii="Calibri" w:hAnsi="Calibri"/>
           <w:sz w:val="22"/>
         </w:rPr>
-        <w:t xml:space="preserve"> is a common function word selected for exclusion from the secondary content-focused aggregate under the active policy. Examples in general-purpose lists can include articles, prepositions, pronouns, auxiliaries, and conjunctions.</w:t>
+        <w:t xml:space="preserve"> is a form selected for exclusion from the recorded stopword-excluded scope. Examples in general-purpose lists can include articles, prepositions, pronouns, auxiliaries, and conjunctions.</w:t>
       </w:r>
     </w:p>
     <w:p>
@@ -9455,7 +9455,958 @@
           <w:rFonts w:ascii="Calibri" w:hAnsi="Calibri"/>
           <w:sz w:val="22"/>
         </w:rPr>
-        <w:t>“Stopword” does not mean meaningless. Function words can be central to rhythm, voice, negation, syntax, deixis, and style. That is why VerseVAD preserves:</w:t>
+        <w:t xml:space="preserve">“Stopword” does not mean meaningless. Function words can be central to rhythm, voice, negation, syntax, deixis, and style. VerseVAD therefore retains evidence once and supports three report scopes: </w:t>
+      </w:r>
+      <w:r>
+        <w:rPr>
+          <w:rFonts w:ascii="Calibri" w:hAnsi="Calibri"/>
+          <w:b/>
+          <w:sz w:val="22"/>
+        </w:rPr>
+        <w:t>All lexical tokens</w:t>
+      </w:r>
+      <w:r>
+        <w:rPr>
+          <w:rFonts w:ascii="Calibri" w:hAnsi="Calibri"/>
+          <w:sz w:val="22"/>
+        </w:rPr>
+        <w:t xml:space="preserve">, </w:t>
+      </w:r>
+      <w:r>
+        <w:rPr>
+          <w:rFonts w:ascii="Calibri" w:hAnsi="Calibri"/>
+          <w:b/>
+          <w:sz w:val="22"/>
+        </w:rPr>
+        <w:t>Stopword-excluded</w:t>
+      </w:r>
+      <w:r>
+        <w:rPr>
+          <w:rFonts w:ascii="Calibri" w:hAnsi="Calibri"/>
+          <w:sz w:val="22"/>
+        </w:rPr>
+        <w:t xml:space="preserve">, and </w:t>
+      </w:r>
+      <w:r>
+        <w:rPr>
+          <w:rFonts w:ascii="Calibri" w:hAnsi="Calibri"/>
+          <w:b/>
+          <w:sz w:val="22"/>
+        </w:rPr>
+        <w:t>Content words only</w:t>
+      </w:r>
+      <w:r>
+        <w:rPr>
+          <w:rFonts w:ascii="Calibri" w:hAnsi="Calibri"/>
+          <w:sz w:val="22"/>
+        </w:rPr>
+        <w:t xml:space="preserve"> (</w:t>
+      </w:r>
+      <w:r>
+        <w:rPr>
+          <w:rFonts w:ascii="Consolas" w:hAnsi="Consolas"/>
+          <w:color w:val="1F4D78"/>
+          <w:sz w:val="19"/>
+        </w:rPr>
+        <w:t>NOUN</w:t>
+      </w:r>
+      <w:r>
+        <w:rPr>
+          <w:rFonts w:ascii="Calibri" w:hAnsi="Calibri"/>
+          <w:sz w:val="22"/>
+        </w:rPr>
+        <w:t xml:space="preserve">, </w:t>
+      </w:r>
+      <w:r>
+        <w:rPr>
+          <w:rFonts w:ascii="Consolas" w:hAnsi="Consolas"/>
+          <w:color w:val="1F4D78"/>
+          <w:sz w:val="19"/>
+        </w:rPr>
+        <w:t>VERB</w:t>
+      </w:r>
+      <w:r>
+        <w:rPr>
+          <w:rFonts w:ascii="Calibri" w:hAnsi="Calibri"/>
+          <w:sz w:val="22"/>
+        </w:rPr>
+        <w:t xml:space="preserve">, </w:t>
+      </w:r>
+      <w:r>
+        <w:rPr>
+          <w:rFonts w:ascii="Consolas" w:hAnsi="Consolas"/>
+          <w:color w:val="1F4D78"/>
+          <w:sz w:val="19"/>
+        </w:rPr>
+        <w:t>ADJ</w:t>
+      </w:r>
+      <w:r>
+        <w:rPr>
+          <w:rFonts w:ascii="Calibri" w:hAnsi="Calibri"/>
+          <w:sz w:val="22"/>
+        </w:rPr>
+        <w:t xml:space="preserve">, and </w:t>
+      </w:r>
+      <w:r>
+        <w:rPr>
+          <w:rFonts w:ascii="Consolas" w:hAnsi="Consolas"/>
+          <w:color w:val="1F4D78"/>
+          <w:sz w:val="19"/>
+        </w:rPr>
+        <w:t>ADV</w:t>
+      </w:r>
+      <w:r>
+        <w:rPr>
+          <w:rFonts w:ascii="Calibri" w:hAnsi="Calibri"/>
+          <w:sz w:val="22"/>
+        </w:rPr>
+        <w:t>). Scope changes do not repeat tokenization or lookup.</w:t>
+      </w:r>
+    </w:p>
+    <w:p>
+      <w:pPr>
+        <w:pStyle w:val="Heading2"/>
+      </w:pPr>
+      <w:r>
+        <w:rPr>
+          <w:rFonts w:ascii="Calibri" w:hAnsi="Calibri"/>
+          <w:sz w:val="22"/>
+        </w:rPr>
+        <w:t>Protected Words</w:t>
+      </w:r>
+    </w:p>
+    <w:p>
+      <w:pPr>
+        <w:widowControl/>
+        <w:spacing w:before="0" w:after="120" w:line="300" w:lineRule="auto"/>
+      </w:pPr>
+      <w:r>
+        <w:rPr>
+          <w:rFonts w:ascii="Calibri" w:hAnsi="Calibri"/>
+          <w:sz w:val="22"/>
+        </w:rPr>
+        <w:t xml:space="preserve">VerseVAD protects a documented set of negations, modals, comparatives, and intensifiers from default exclusion. Examples include </w:t>
+      </w:r>
+      <w:r>
+        <w:rPr>
+          <w:rFonts w:ascii="Consolas" w:hAnsi="Consolas"/>
+          <w:color w:val="1F4D78"/>
+          <w:sz w:val="19"/>
+        </w:rPr>
+        <w:t>not</w:t>
+      </w:r>
+      <w:r>
+        <w:rPr>
+          <w:rFonts w:ascii="Calibri" w:hAnsi="Calibri"/>
+          <w:sz w:val="22"/>
+        </w:rPr>
+        <w:t xml:space="preserve">, </w:t>
+      </w:r>
+      <w:r>
+        <w:rPr>
+          <w:rFonts w:ascii="Consolas" w:hAnsi="Consolas"/>
+          <w:color w:val="1F4D78"/>
+          <w:sz w:val="19"/>
+        </w:rPr>
+        <w:t>never</w:t>
+      </w:r>
+      <w:r>
+        <w:rPr>
+          <w:rFonts w:ascii="Calibri" w:hAnsi="Calibri"/>
+          <w:sz w:val="22"/>
+        </w:rPr>
+        <w:t xml:space="preserve">, </w:t>
+      </w:r>
+      <w:r>
+        <w:rPr>
+          <w:rFonts w:ascii="Consolas" w:hAnsi="Consolas"/>
+          <w:color w:val="1F4D78"/>
+          <w:sz w:val="19"/>
+        </w:rPr>
+        <w:t>no</w:t>
+      </w:r>
+      <w:r>
+        <w:rPr>
+          <w:rFonts w:ascii="Calibri" w:hAnsi="Calibri"/>
+          <w:sz w:val="22"/>
+        </w:rPr>
+        <w:t xml:space="preserve">, </w:t>
+      </w:r>
+      <w:r>
+        <w:rPr>
+          <w:rFonts w:ascii="Consolas" w:hAnsi="Consolas"/>
+          <w:color w:val="1F4D78"/>
+          <w:sz w:val="19"/>
+        </w:rPr>
+        <w:t>without</w:t>
+      </w:r>
+      <w:r>
+        <w:rPr>
+          <w:rFonts w:ascii="Calibri" w:hAnsi="Calibri"/>
+          <w:sz w:val="22"/>
+        </w:rPr>
+        <w:t xml:space="preserve">, </w:t>
+      </w:r>
+      <w:r>
+        <w:rPr>
+          <w:rFonts w:ascii="Consolas" w:hAnsi="Consolas"/>
+          <w:color w:val="1F4D78"/>
+          <w:sz w:val="19"/>
+        </w:rPr>
+        <w:t>might</w:t>
+      </w:r>
+      <w:r>
+        <w:rPr>
+          <w:rFonts w:ascii="Calibri" w:hAnsi="Calibri"/>
+          <w:sz w:val="22"/>
+        </w:rPr>
+        <w:t xml:space="preserve">, </w:t>
+      </w:r>
+      <w:r>
+        <w:rPr>
+          <w:rFonts w:ascii="Consolas" w:hAnsi="Consolas"/>
+          <w:color w:val="1F4D78"/>
+          <w:sz w:val="19"/>
+        </w:rPr>
+        <w:t>more</w:t>
+      </w:r>
+      <w:r>
+        <w:rPr>
+          <w:rFonts w:ascii="Calibri" w:hAnsi="Calibri"/>
+          <w:sz w:val="22"/>
+        </w:rPr>
+        <w:t xml:space="preserve">, </w:t>
+      </w:r>
+      <w:r>
+        <w:rPr>
+          <w:rFonts w:ascii="Consolas" w:hAnsi="Consolas"/>
+          <w:color w:val="1F4D78"/>
+          <w:sz w:val="19"/>
+        </w:rPr>
+        <w:t>most</w:t>
+      </w:r>
+      <w:r>
+        <w:rPr>
+          <w:rFonts w:ascii="Calibri" w:hAnsi="Calibri"/>
+          <w:sz w:val="22"/>
+        </w:rPr>
+        <w:t xml:space="preserve">, </w:t>
+      </w:r>
+      <w:r>
+        <w:rPr>
+          <w:rFonts w:ascii="Consolas" w:hAnsi="Consolas"/>
+          <w:color w:val="1F4D78"/>
+          <w:sz w:val="19"/>
+        </w:rPr>
+        <w:t>too</w:t>
+      </w:r>
+      <w:r>
+        <w:rPr>
+          <w:rFonts w:ascii="Calibri" w:hAnsi="Calibri"/>
+          <w:sz w:val="22"/>
+        </w:rPr>
+        <w:t xml:space="preserve">, and </w:t>
+      </w:r>
+      <w:r>
+        <w:rPr>
+          <w:rFonts w:ascii="Consolas" w:hAnsi="Consolas"/>
+          <w:color w:val="1F4D78"/>
+          <w:sz w:val="19"/>
+        </w:rPr>
+        <w:t>very</w:t>
+      </w:r>
+      <w:r>
+        <w:rPr>
+          <w:rFonts w:ascii="Calibri" w:hAnsi="Calibri"/>
+          <w:sz w:val="22"/>
+        </w:rPr>
+        <w:t>.</w:t>
+      </w:r>
+    </w:p>
+    <w:p>
+      <w:pPr>
+        <w:pStyle w:val="Heading2"/>
+      </w:pPr>
+      <w:r>
+        <w:rPr>
+          <w:rFonts w:ascii="Calibri" w:hAnsi="Calibri"/>
+          <w:sz w:val="22"/>
+        </w:rPr>
+        <w:t>Custom Stopword</w:t>
+      </w:r>
+    </w:p>
+    <w:p>
+      <w:pPr>
+        <w:widowControl/>
+        <w:spacing w:before="0" w:after="120" w:line="300" w:lineRule="auto"/>
+      </w:pPr>
+      <w:r>
+        <w:rPr>
+          <w:rFonts w:ascii="Calibri" w:hAnsi="Calibri"/>
+          <w:sz w:val="22"/>
+        </w:rPr>
+        <w:t xml:space="preserve">A </w:t>
+      </w:r>
+      <w:r>
+        <w:rPr>
+          <w:rFonts w:ascii="Calibri" w:hAnsi="Calibri"/>
+          <w:b/>
+          <w:sz w:val="22"/>
+        </w:rPr>
+        <w:t>custom stopword</w:t>
+      </w:r>
+      <w:r>
+        <w:rPr>
+          <w:rFonts w:ascii="Calibri" w:hAnsi="Calibri"/>
+          <w:sz w:val="22"/>
+        </w:rPr>
+        <w:t xml:space="preserve"> is a word the user deliberately adds to the active stopword list for a specific analytical purpose. For example, adding </w:t>
+      </w:r>
+      <w:r>
+        <w:rPr>
+          <w:rFonts w:ascii="Consolas" w:hAnsi="Consolas"/>
+          <w:color w:val="1F4D78"/>
+          <w:sz w:val="19"/>
+        </w:rPr>
+        <w:t>raven</w:t>
+      </w:r>
+      <w:r>
+        <w:rPr>
+          <w:rFonts w:ascii="Calibri" w:hAnsi="Calibri"/>
+          <w:sz w:val="22"/>
+        </w:rPr>
+        <w:t xml:space="preserve"> would exclude it from the stopword-excluded aggregate while preserving it in the all-lexical result and audit.</w:t>
+      </w:r>
+    </w:p>
+    <w:p>
+      <w:pPr>
+        <w:widowControl/>
+        <w:spacing w:before="0" w:after="120" w:line="300" w:lineRule="auto"/>
+      </w:pPr>
+      <w:r>
+        <w:rPr>
+          <w:rFonts w:ascii="Calibri" w:hAnsi="Calibri"/>
+          <w:sz w:val="22"/>
+        </w:rPr>
+        <w:t>This is a methodological decision, not a declaration that the word is universally unimportant.</w:t>
+      </w:r>
+    </w:p>
+    <w:p>
+      <w:pPr>
+        <w:pStyle w:val="Heading2"/>
+      </w:pPr>
+      <w:r>
+        <w:rPr>
+          <w:rFonts w:ascii="Calibri" w:hAnsi="Calibri"/>
+          <w:sz w:val="22"/>
+        </w:rPr>
+        <w:t>Scope-Relative Coverage</w:t>
+      </w:r>
+    </w:p>
+    <w:p>
+      <w:pPr>
+        <w:pStyle w:val="Formula"/>
+      </w:pPr>
+      <w:r>
+        <w:rPr>
+          <w:rFonts w:ascii="Consolas" w:hAnsi="Consolas"/>
+          <w:color w:val="1F4D78"/>
+          <w:sz w:val="19"/>
+        </w:rPr>
+        <w:t>coverage = matched eligible positions / eligible positions in the selected scope</w:t>
+      </w:r>
+    </w:p>
+    <w:p>
+      <w:pPr>
+        <w:widowControl/>
+        <w:spacing w:before="0" w:after="120" w:line="300" w:lineRule="auto"/>
+      </w:pPr>
+      <w:r>
+        <w:rPr>
+          <w:rFonts w:ascii="Calibri" w:hAnsi="Calibri"/>
+          <w:sz w:val="22"/>
+        </w:rPr>
+        <w:t>Excluded stopwords and excluded non-content words are outside the selected denominator and are not unmatched. A complete matched expression is preserved when it intersects the selected scope.</w:t>
+      </w:r>
+    </w:p>
+    <w:p>
+      <w:pPr>
+        <w:pStyle w:val="Heading1"/>
+      </w:pPr>
+      <w:r>
+        <w:rPr>
+          <w:rFonts w:ascii="Calibri" w:hAnsi="Calibri"/>
+          <w:sz w:val="22"/>
+        </w:rPr>
+        <w:t>9. Token-Weighted and Type-Weighted Statistics</w:t>
+      </w:r>
+    </w:p>
+    <w:p>
+      <w:pPr>
+        <w:pStyle w:val="Heading2"/>
+      </w:pPr>
+      <w:r>
+        <w:rPr>
+          <w:rFonts w:ascii="Calibri" w:hAnsi="Calibri"/>
+          <w:sz w:val="22"/>
+        </w:rPr>
+        <w:t>Token-Weighted</w:t>
+      </w:r>
+    </w:p>
+    <w:p>
+      <w:pPr>
+        <w:widowControl/>
+        <w:spacing w:before="0" w:after="120" w:line="300" w:lineRule="auto"/>
+      </w:pPr>
+      <w:r>
+        <w:rPr>
+          <w:rFonts w:ascii="Calibri" w:hAnsi="Calibri"/>
+          <w:sz w:val="22"/>
+        </w:rPr>
+        <w:t xml:space="preserve">In a </w:t>
+      </w:r>
+      <w:r>
+        <w:rPr>
+          <w:rFonts w:ascii="Calibri" w:hAnsi="Calibri"/>
+          <w:b/>
+          <w:sz w:val="22"/>
+        </w:rPr>
+        <w:t>token-weighted</w:t>
+      </w:r>
+      <w:r>
+        <w:rPr>
+          <w:rFonts w:ascii="Calibri" w:hAnsi="Calibri"/>
+          <w:sz w:val="22"/>
+        </w:rPr>
+        <w:t xml:space="preserve"> statistic, every included occurrence contributes.</w:t>
+      </w:r>
+    </w:p>
+    <w:p>
+      <w:pPr>
+        <w:pStyle w:val="Formula"/>
+      </w:pPr>
+      <w:r>
+        <w:rPr>
+          <w:rFonts w:ascii="Consolas" w:hAnsi="Consolas"/>
+          <w:color w:val="1F4D78"/>
+          <w:sz w:val="19"/>
+        </w:rPr>
+        <w:t>mean_token = sum(x_i) / N</w:t>
+      </w:r>
+    </w:p>
+    <w:p>
+      <w:pPr>
+        <w:widowControl/>
+        <w:spacing w:before="0" w:after="120" w:line="300" w:lineRule="auto"/>
+      </w:pPr>
+      <w:r>
+        <w:rPr>
+          <w:rFonts w:ascii="Calibri" w:hAnsi="Calibri"/>
+          <w:sz w:val="22"/>
+        </w:rPr>
+        <w:t xml:space="preserve">where </w:t>
+      </w:r>
+      <w:r>
+        <w:rPr>
+          <w:rFonts w:ascii="Consolas" w:hAnsi="Consolas"/>
+          <w:color w:val="1F4D78"/>
+          <w:sz w:val="19"/>
+        </w:rPr>
+        <w:t>x_i</w:t>
+      </w:r>
+      <w:r>
+        <w:rPr>
+          <w:rFonts w:ascii="Calibri" w:hAnsi="Calibri"/>
+          <w:sz w:val="22"/>
+        </w:rPr>
+        <w:t xml:space="preserve"> is the rating of included occurrence </w:t>
+      </w:r>
+      <w:r>
+        <w:rPr>
+          <w:rFonts w:ascii="Consolas" w:hAnsi="Consolas"/>
+          <w:color w:val="1F4D78"/>
+          <w:sz w:val="19"/>
+        </w:rPr>
+        <w:t>i</w:t>
+      </w:r>
+      <w:r>
+        <w:rPr>
+          <w:rFonts w:ascii="Calibri" w:hAnsi="Calibri"/>
+          <w:sz w:val="22"/>
+        </w:rPr>
+        <w:t xml:space="preserve"> and </w:t>
+      </w:r>
+      <w:r>
+        <w:rPr>
+          <w:rFonts w:ascii="Consolas" w:hAnsi="Consolas"/>
+          <w:color w:val="1F4D78"/>
+          <w:sz w:val="19"/>
+        </w:rPr>
+        <w:t>N</w:t>
+      </w:r>
+      <w:r>
+        <w:rPr>
+          <w:rFonts w:ascii="Calibri" w:hAnsi="Calibri"/>
+          <w:sz w:val="22"/>
+        </w:rPr>
+        <w:t xml:space="preserve"> is the number of included matched observations.</w:t>
+      </w:r>
+    </w:p>
+    <w:p>
+      <w:pPr>
+        <w:widowControl/>
+        <w:spacing w:before="0" w:after="120" w:line="300" w:lineRule="auto"/>
+      </w:pPr>
+      <w:r>
+        <w:rPr>
+          <w:rFonts w:ascii="Calibri" w:hAnsi="Calibri"/>
+          <w:sz w:val="22"/>
+        </w:rPr>
+        <w:t>Question answered: “What affective ratings does a reader encounter across the matched words and accepted phrases, including repetition?”</w:t>
+      </w:r>
+    </w:p>
+    <w:p>
+      <w:pPr>
+        <w:widowControl/>
+        <w:spacing w:before="0" w:after="120" w:line="300" w:lineRule="auto"/>
+      </w:pPr>
+      <w:r>
+        <w:rPr>
+          <w:rFonts w:ascii="Calibri" w:hAnsi="Calibri"/>
+          <w:sz w:val="22"/>
+        </w:rPr>
+        <w:t>Use token weighting when repetition and textual exposure matter.</w:t>
+      </w:r>
+    </w:p>
+    <w:p>
+      <w:pPr>
+        <w:pStyle w:val="Heading2"/>
+      </w:pPr>
+      <w:r>
+        <w:rPr>
+          <w:rFonts w:ascii="Calibri" w:hAnsi="Calibri"/>
+          <w:sz w:val="22"/>
+        </w:rPr>
+        <w:t>Type-Weighted</w:t>
+      </w:r>
+    </w:p>
+    <w:p>
+      <w:pPr>
+        <w:widowControl/>
+        <w:spacing w:before="0" w:after="120" w:line="300" w:lineRule="auto"/>
+      </w:pPr>
+      <w:r>
+        <w:rPr>
+          <w:rFonts w:ascii="Calibri" w:hAnsi="Calibri"/>
+          <w:sz w:val="22"/>
+        </w:rPr>
+        <w:t xml:space="preserve">In a </w:t>
+      </w:r>
+      <w:r>
+        <w:rPr>
+          <w:rFonts w:ascii="Calibri" w:hAnsi="Calibri"/>
+          <w:b/>
+          <w:sz w:val="22"/>
+        </w:rPr>
+        <w:t>type-weighted</w:t>
+      </w:r>
+      <w:r>
+        <w:rPr>
+          <w:rFonts w:ascii="Calibri" w:hAnsi="Calibri"/>
+          <w:sz w:val="22"/>
+        </w:rPr>
+        <w:t xml:space="preserve"> statistic, every distinct matched lexicon entry contributes once.</w:t>
+      </w:r>
+    </w:p>
+    <w:p>
+      <w:pPr>
+        <w:pStyle w:val="Formula"/>
+      </w:pPr>
+      <w:r>
+        <w:rPr>
+          <w:rFonts w:ascii="Consolas" w:hAnsi="Consolas"/>
+          <w:color w:val="1F4D78"/>
+          <w:sz w:val="19"/>
+        </w:rPr>
+        <w:t>mean_type = sum(x_t) / T</w:t>
+      </w:r>
+    </w:p>
+    <w:p>
+      <w:pPr>
+        <w:widowControl/>
+        <w:spacing w:before="0" w:after="120" w:line="300" w:lineRule="auto"/>
+      </w:pPr>
+      <w:r>
+        <w:rPr>
+          <w:rFonts w:ascii="Calibri" w:hAnsi="Calibri"/>
+          <w:sz w:val="22"/>
+        </w:rPr>
+        <w:t xml:space="preserve">where </w:t>
+      </w:r>
+      <w:r>
+        <w:rPr>
+          <w:rFonts w:ascii="Consolas" w:hAnsi="Consolas"/>
+          <w:color w:val="1F4D78"/>
+          <w:sz w:val="19"/>
+        </w:rPr>
+        <w:t>x_t</w:t>
+      </w:r>
+      <w:r>
+        <w:rPr>
+          <w:rFonts w:ascii="Calibri" w:hAnsi="Calibri"/>
+          <w:sz w:val="22"/>
+        </w:rPr>
+        <w:t xml:space="preserve"> is the rating for distinct matched entry </w:t>
+      </w:r>
+      <w:r>
+        <w:rPr>
+          <w:rFonts w:ascii="Consolas" w:hAnsi="Consolas"/>
+          <w:color w:val="1F4D78"/>
+          <w:sz w:val="19"/>
+        </w:rPr>
+        <w:t>t</w:t>
+      </w:r>
+      <w:r>
+        <w:rPr>
+          <w:rFonts w:ascii="Calibri" w:hAnsi="Calibri"/>
+          <w:sz w:val="22"/>
+        </w:rPr>
+        <w:t xml:space="preserve"> and </w:t>
+      </w:r>
+      <w:r>
+        <w:rPr>
+          <w:rFonts w:ascii="Consolas" w:hAnsi="Consolas"/>
+          <w:color w:val="1F4D78"/>
+          <w:sz w:val="19"/>
+        </w:rPr>
+        <w:t>T</w:t>
+      </w:r>
+      <w:r>
+        <w:rPr>
+          <w:rFonts w:ascii="Calibri" w:hAnsi="Calibri"/>
+          <w:sz w:val="22"/>
+        </w:rPr>
+        <w:t xml:space="preserve"> is the number of distinct included matched entries.</w:t>
+      </w:r>
+    </w:p>
+    <w:p>
+      <w:pPr>
+        <w:widowControl/>
+        <w:spacing w:before="0" w:after="120" w:line="300" w:lineRule="auto"/>
+      </w:pPr>
+      <w:r>
+        <w:rPr>
+          <w:rFonts w:ascii="Calibri" w:hAnsi="Calibri"/>
+          <w:sz w:val="22"/>
+        </w:rPr>
+        <w:t>Question answered: “What is the profile of the distinct matched vocabulary inventory if repeated entries count only once?”</w:t>
+      </w:r>
+    </w:p>
+    <w:p>
+      <w:pPr>
+        <w:widowControl/>
+        <w:spacing w:before="0" w:after="120" w:line="300" w:lineRule="auto"/>
+      </w:pPr>
+      <w:r>
+        <w:rPr>
+          <w:rFonts w:ascii="Calibri" w:hAnsi="Calibri"/>
+          <w:sz w:val="22"/>
+        </w:rPr>
+        <w:t>Use type weighting to reduce the influence of repetition.</w:t>
+      </w:r>
+    </w:p>
+    <w:p>
+      <w:pPr>
+        <w:pStyle w:val="Heading2"/>
+      </w:pPr>
+      <w:r>
+        <w:rPr>
+          <w:rFonts w:ascii="Calibri" w:hAnsi="Calibri"/>
+          <w:sz w:val="22"/>
+        </w:rPr>
+        <w:t>Interpreting Their Difference</w:t>
+      </w:r>
+    </w:p>
+    <w:p>
+      <w:pPr>
+        <w:widowControl/>
+        <w:spacing w:before="0" w:after="120" w:line="300" w:lineRule="auto"/>
+      </w:pPr>
+      <w:r>
+        <w:rPr>
+          <w:rFonts w:ascii="Calibri" w:hAnsi="Calibri"/>
+          <w:sz w:val="22"/>
+        </w:rPr>
+        <w:t>If token- and type-weighted means are close, repetition changes the reported center little. If they diverge, repeated entries shift the token-weighted profile away from the distinct-vocabulary profile.</w:t>
+      </w:r>
+    </w:p>
+    <w:p>
+      <w:pPr>
+        <w:widowControl/>
+        <w:spacing w:before="0" w:after="120" w:line="300" w:lineRule="auto"/>
+      </w:pPr>
+      <w:r>
+        <w:rPr>
+          <w:rFonts w:ascii="Calibri" w:hAnsi="Calibri"/>
+          <w:sz w:val="22"/>
+        </w:rPr>
+        <w:t>Neither weighting is automatically superior. They answer different questions and should be named explicitly.</w:t>
+      </w:r>
+    </w:p>
+    <w:p>
+      <w:pPr>
+        <w:pStyle w:val="Heading1"/>
+      </w:pPr>
+      <w:r>
+        <w:rPr>
+          <w:rFonts w:ascii="Calibri" w:hAnsi="Calibri"/>
+          <w:sz w:val="22"/>
+        </w:rPr>
+        <w:t>10. Means, Medians, and Dispersion</w:t>
+      </w:r>
+    </w:p>
+    <w:p>
+      <w:pPr>
+        <w:pStyle w:val="Heading2"/>
+      </w:pPr>
+      <w:r>
+        <w:rPr>
+          <w:rFonts w:ascii="Calibri" w:hAnsi="Calibri"/>
+          <w:sz w:val="22"/>
+        </w:rPr>
+        <w:t>Mean</w:t>
+      </w:r>
+    </w:p>
+    <w:p>
+      <w:pPr>
+        <w:widowControl/>
+        <w:spacing w:before="0" w:after="120" w:line="300" w:lineRule="auto"/>
+      </w:pPr>
+      <w:r>
+        <w:rPr>
+          <w:rFonts w:ascii="Calibri" w:hAnsi="Calibri"/>
+          <w:sz w:val="22"/>
+        </w:rPr>
+        <w:t xml:space="preserve">The </w:t>
+      </w:r>
+      <w:r>
+        <w:rPr>
+          <w:rFonts w:ascii="Calibri" w:hAnsi="Calibri"/>
+          <w:b/>
+          <w:sz w:val="22"/>
+        </w:rPr>
+        <w:t>mean</w:t>
+      </w:r>
+      <w:r>
+        <w:rPr>
+          <w:rFonts w:ascii="Calibri" w:hAnsi="Calibri"/>
+          <w:sz w:val="22"/>
+        </w:rPr>
+        <w:t xml:space="preserve"> is the arithmetic average of the included values.</w:t>
+      </w:r>
+    </w:p>
+    <w:p>
+      <w:pPr>
+        <w:pStyle w:val="Formula"/>
+      </w:pPr>
+      <w:r>
+        <w:rPr>
+          <w:rFonts w:ascii="Consolas" w:hAnsi="Consolas"/>
+          <w:color w:val="1F4D78"/>
+          <w:sz w:val="19"/>
+        </w:rPr>
+        <w:t>mean = sum(values) / number_of_values</w:t>
+      </w:r>
+    </w:p>
+    <w:p>
+      <w:pPr>
+        <w:widowControl/>
+        <w:spacing w:before="0" w:after="120" w:line="300" w:lineRule="auto"/>
+      </w:pPr>
+      <w:r>
+        <w:rPr>
+          <w:rFonts w:ascii="Calibri" w:hAnsi="Calibri"/>
+          <w:sz w:val="22"/>
+        </w:rPr>
+        <w:t>A mean identifies a center. It does not show whether the values cluster tightly or contain strong values on both sides.</w:t>
+      </w:r>
+    </w:p>
+    <w:p>
+      <w:pPr>
+        <w:pStyle w:val="Heading2"/>
+      </w:pPr>
+      <w:r>
+        <w:rPr>
+          <w:rFonts w:ascii="Calibri" w:hAnsi="Calibri"/>
+          <w:sz w:val="22"/>
+        </w:rPr>
+        <w:t>Median</w:t>
+      </w:r>
+    </w:p>
+    <w:p>
+      <w:pPr>
+        <w:widowControl/>
+        <w:spacing w:before="0" w:after="120" w:line="300" w:lineRule="auto"/>
+      </w:pPr>
+      <w:r>
+        <w:rPr>
+          <w:rFonts w:ascii="Calibri" w:hAnsi="Calibri"/>
+          <w:sz w:val="22"/>
+        </w:rPr>
+        <w:t xml:space="preserve">The </w:t>
+      </w:r>
+      <w:r>
+        <w:rPr>
+          <w:rFonts w:ascii="Calibri" w:hAnsi="Calibri"/>
+          <w:b/>
+          <w:sz w:val="22"/>
+        </w:rPr>
+        <w:t>median</w:t>
+      </w:r>
+      <w:r>
+        <w:rPr>
+          <w:rFonts w:ascii="Calibri" w:hAnsi="Calibri"/>
+          <w:sz w:val="22"/>
+        </w:rPr>
+        <w:t xml:space="preserve"> is the middle value after sorting. For an even number of values, it is the mean of the two middle values. It is less sensitive than the mean to a small number of extreme values.</w:t>
+      </w:r>
+    </w:p>
+    <w:p>
+      <w:pPr>
+        <w:widowControl/>
+        <w:spacing w:before="0" w:after="120" w:line="300" w:lineRule="auto"/>
+      </w:pPr>
+      <w:r>
+        <w:rPr>
+          <w:rFonts w:ascii="Calibri" w:hAnsi="Calibri"/>
+          <w:sz w:val="22"/>
+        </w:rPr>
+        <w:t>For concreteness, VerseVAD applies the same mean and median definitions to the source 1-5 ratings assigned to included lexical-token positions. Empty or wholly unmatched inputs have missing aggregates, never a neutral midpoint.</w:t>
+      </w:r>
+    </w:p>
+    <w:p>
+      <w:pPr>
+        <w:pStyle w:val="Heading2"/>
+      </w:pPr>
+      <w:r>
+        <w:rPr>
+          <w:rFonts w:ascii="Calibri" w:hAnsi="Calibri"/>
+          <w:sz w:val="22"/>
+        </w:rPr>
+        <w:t>Dispersion of Matched Ratings</w:t>
+      </w:r>
+    </w:p>
+    <w:p>
+      <w:pPr>
+        <w:widowControl/>
+        <w:spacing w:before="0" w:after="120" w:line="300" w:lineRule="auto"/>
+      </w:pPr>
+      <w:r>
+        <w:rPr>
+          <w:rFonts w:ascii="Calibri" w:hAnsi="Calibri"/>
+          <w:b/>
+          <w:sz w:val="22"/>
+        </w:rPr>
+        <w:t>Dispersion</w:t>
+      </w:r>
+      <w:r>
+        <w:rPr>
+          <w:rFonts w:ascii="Calibri" w:hAnsi="Calibri"/>
+          <w:sz w:val="22"/>
+        </w:rPr>
+        <w:t xml:space="preserve"> describes how spread out the included matched ratings are around their center.</w:t>
+      </w:r>
+    </w:p>
+    <w:p>
+      <w:pPr>
+        <w:widowControl/>
+        <w:spacing w:before="0" w:after="120" w:line="300" w:lineRule="auto"/>
+      </w:pPr>
+      <w:r>
+        <w:rPr>
+          <w:rFonts w:ascii="Calibri" w:hAnsi="Calibri"/>
+          <w:sz w:val="22"/>
+        </w:rPr>
+        <w:t xml:space="preserve">VerseVAD reports </w:t>
+      </w:r>
+      <w:r>
+        <w:rPr>
+          <w:rFonts w:ascii="Calibri" w:hAnsi="Calibri"/>
+          <w:b/>
+          <w:sz w:val="22"/>
+        </w:rPr>
+        <w:t>population standard deviation</w:t>
+      </w:r>
+      <w:r>
+        <w:rPr>
+          <w:rFonts w:ascii="Calibri" w:hAnsi="Calibri"/>
+          <w:sz w:val="22"/>
+        </w:rPr>
+        <w:t xml:space="preserve"> for the complete selected matched set:</w:t>
+      </w:r>
+    </w:p>
+    <w:p>
+      <w:pPr>
+        <w:pStyle w:val="Formula"/>
+      </w:pPr>
+      <w:r>
+        <w:rPr>
+          <w:rFonts w:ascii="Consolas" w:hAnsi="Consolas"/>
+          <w:color w:val="1F4D78"/>
+          <w:sz w:val="19"/>
+        </w:rPr>
+        <w:t>SD_population = sqrt(sum((x_i - mean)^2) / N)</w:t>
+      </w:r>
+    </w:p>
+    <w:p>
+      <w:pPr>
+        <w:widowControl/>
+        <w:spacing w:before="0" w:after="120" w:line="300" w:lineRule="auto"/>
+      </w:pPr>
+      <w:r>
+        <w:rPr>
+          <w:rFonts w:ascii="Calibri" w:hAnsi="Calibri"/>
+          <w:sz w:val="22"/>
+        </w:rPr>
+        <w:t>A standard deviation near 0 means the included ratings are tightly clustered. A larger standard deviation means they are more dispersed.</w:t>
+      </w:r>
+    </w:p>
+    <w:p>
+      <w:pPr>
+        <w:widowControl/>
+        <w:spacing w:before="0" w:after="120" w:line="300" w:lineRule="auto"/>
+      </w:pPr>
+      <w:r>
+        <w:rPr>
+          <w:rFonts w:ascii="Calibri" w:hAnsi="Calibri"/>
+          <w:sz w:val="22"/>
+        </w:rPr>
+        <w:t>On the normalized 0-to-1 scale, possible population SD values are bounded, but there is no universal literary threshold for “small” or “large.” Compare like with like: same construct, lexicon, scale, view, weighting, and unit of analysis.</w:t>
+      </w:r>
+    </w:p>
+    <w:p>
+      <w:pPr>
+        <w:pStyle w:val="Heading2"/>
+      </w:pPr>
+      <w:r>
+        <w:rPr>
+          <w:rFonts w:ascii="Calibri" w:hAnsi="Calibri"/>
+          <w:sz w:val="22"/>
+        </w:rPr>
+        <w:t>What Dispersion Does Not Mean</w:t>
+      </w:r>
+    </w:p>
+    <w:p>
+      <w:pPr>
+        <w:widowControl/>
+        <w:spacing w:before="0" w:after="120" w:line="300" w:lineRule="auto"/>
+      </w:pPr>
+      <w:r>
+        <w:rPr>
+          <w:rFonts w:ascii="Calibri" w:hAnsi="Calibri"/>
+          <w:sz w:val="22"/>
+        </w:rPr>
+        <w:t>Work-level dispersion is not:</w:t>
       </w:r>
     </w:p>
     <w:p>
@@ -9471,17 +10422,9 @@
       <w:r>
         <w:rPr>
           <w:rFonts w:ascii="Calibri" w:hAnsi="Calibri"/>
-          <w:b/>
-          <w:sz w:val="22"/>
-        </w:rPr>
-        <w:t>All Matched Observations:</w:t>
-      </w:r>
-      <w:r>
-        <w:rPr>
-          <w:rFonts w:ascii="Calibri" w:hAnsi="Calibri"/>
-          <w:sz w:val="22"/>
-        </w:rPr>
-        <w:t xml:space="preserve"> every included lexicon match.</w:t>
+          <w:sz w:val="22"/>
+        </w:rPr>
+        <w:t>the uncertainty of the work mean;</w:t>
       </w:r>
     </w:p>
     <w:p>
@@ -9497,891 +10440,9 @@
       <w:r>
         <w:rPr>
           <w:rFonts w:ascii="Calibri" w:hAnsi="Calibri"/>
-          <w:b/>
-          <w:sz w:val="22"/>
-        </w:rPr>
-        <w:t>Stopwords Excluded:</w:t>
-      </w:r>
-      <w:r>
-        <w:rPr>
-          <w:rFonts w:ascii="Calibri" w:hAnsi="Calibri"/>
-          <w:sz w:val="22"/>
-        </w:rPr>
-        <w:t xml:space="preserve"> the same matches after the recorded stopword policy removes selected observations from the secondary aggregate.</w:t>
-      </w:r>
-    </w:p>
-    <w:p>
-      <w:pPr>
-        <w:widowControl/>
-        <w:spacing w:before="0" w:after="120" w:line="300" w:lineRule="auto"/>
-      </w:pPr>
-      <w:r>
-        <w:rPr>
-          <w:rFonts w:ascii="Calibri" w:hAnsi="Calibri"/>
-          <w:sz w:val="22"/>
-        </w:rPr>
-        <w:t>The all-matched result is never destroyed.</w:t>
-      </w:r>
-    </w:p>
-    <w:p>
-      <w:pPr>
-        <w:pStyle w:val="Heading2"/>
-      </w:pPr>
-      <w:r>
-        <w:rPr>
-          <w:rFonts w:ascii="Calibri" w:hAnsi="Calibri"/>
-          <w:sz w:val="22"/>
-        </w:rPr>
-        <w:t>Protected Words</w:t>
-      </w:r>
-    </w:p>
-    <w:p>
-      <w:pPr>
-        <w:widowControl/>
-        <w:spacing w:before="0" w:after="120" w:line="300" w:lineRule="auto"/>
-      </w:pPr>
-      <w:r>
-        <w:rPr>
-          <w:rFonts w:ascii="Calibri" w:hAnsi="Calibri"/>
-          <w:sz w:val="22"/>
-        </w:rPr>
-        <w:t xml:space="preserve">VerseVAD protects a documented set of negations, modals, comparatives, and intensifiers from default exclusion. Examples include </w:t>
-      </w:r>
-      <w:r>
-        <w:rPr>
-          <w:rFonts w:ascii="Consolas" w:hAnsi="Consolas"/>
-          <w:color w:val="1F4D78"/>
-          <w:sz w:val="19"/>
-        </w:rPr>
-        <w:t>not</w:t>
-      </w:r>
-      <w:r>
-        <w:rPr>
-          <w:rFonts w:ascii="Calibri" w:hAnsi="Calibri"/>
-          <w:sz w:val="22"/>
-        </w:rPr>
-        <w:t xml:space="preserve">, </w:t>
-      </w:r>
-      <w:r>
-        <w:rPr>
-          <w:rFonts w:ascii="Consolas" w:hAnsi="Consolas"/>
-          <w:color w:val="1F4D78"/>
-          <w:sz w:val="19"/>
-        </w:rPr>
-        <w:t>never</w:t>
-      </w:r>
-      <w:r>
-        <w:rPr>
-          <w:rFonts w:ascii="Calibri" w:hAnsi="Calibri"/>
-          <w:sz w:val="22"/>
-        </w:rPr>
-        <w:t xml:space="preserve">, </w:t>
-      </w:r>
-      <w:r>
-        <w:rPr>
-          <w:rFonts w:ascii="Consolas" w:hAnsi="Consolas"/>
-          <w:color w:val="1F4D78"/>
-          <w:sz w:val="19"/>
-        </w:rPr>
-        <w:t>no</w:t>
-      </w:r>
-      <w:r>
-        <w:rPr>
-          <w:rFonts w:ascii="Calibri" w:hAnsi="Calibri"/>
-          <w:sz w:val="22"/>
-        </w:rPr>
-        <w:t xml:space="preserve">, </w:t>
-      </w:r>
-      <w:r>
-        <w:rPr>
-          <w:rFonts w:ascii="Consolas" w:hAnsi="Consolas"/>
-          <w:color w:val="1F4D78"/>
-          <w:sz w:val="19"/>
-        </w:rPr>
-        <w:t>without</w:t>
-      </w:r>
-      <w:r>
-        <w:rPr>
-          <w:rFonts w:ascii="Calibri" w:hAnsi="Calibri"/>
-          <w:sz w:val="22"/>
-        </w:rPr>
-        <w:t xml:space="preserve">, </w:t>
-      </w:r>
-      <w:r>
-        <w:rPr>
-          <w:rFonts w:ascii="Consolas" w:hAnsi="Consolas"/>
-          <w:color w:val="1F4D78"/>
-          <w:sz w:val="19"/>
-        </w:rPr>
-        <w:t>might</w:t>
-      </w:r>
-      <w:r>
-        <w:rPr>
-          <w:rFonts w:ascii="Calibri" w:hAnsi="Calibri"/>
-          <w:sz w:val="22"/>
-        </w:rPr>
-        <w:t xml:space="preserve">, </w:t>
-      </w:r>
-      <w:r>
-        <w:rPr>
-          <w:rFonts w:ascii="Consolas" w:hAnsi="Consolas"/>
-          <w:color w:val="1F4D78"/>
-          <w:sz w:val="19"/>
-        </w:rPr>
-        <w:t>more</w:t>
-      </w:r>
-      <w:r>
-        <w:rPr>
-          <w:rFonts w:ascii="Calibri" w:hAnsi="Calibri"/>
-          <w:sz w:val="22"/>
-        </w:rPr>
-        <w:t xml:space="preserve">, </w:t>
-      </w:r>
-      <w:r>
-        <w:rPr>
-          <w:rFonts w:ascii="Consolas" w:hAnsi="Consolas"/>
-          <w:color w:val="1F4D78"/>
-          <w:sz w:val="19"/>
-        </w:rPr>
-        <w:t>most</w:t>
-      </w:r>
-      <w:r>
-        <w:rPr>
-          <w:rFonts w:ascii="Calibri" w:hAnsi="Calibri"/>
-          <w:sz w:val="22"/>
-        </w:rPr>
-        <w:t xml:space="preserve">, </w:t>
-      </w:r>
-      <w:r>
-        <w:rPr>
-          <w:rFonts w:ascii="Consolas" w:hAnsi="Consolas"/>
-          <w:color w:val="1F4D78"/>
-          <w:sz w:val="19"/>
-        </w:rPr>
-        <w:t>too</w:t>
-      </w:r>
-      <w:r>
-        <w:rPr>
-          <w:rFonts w:ascii="Calibri" w:hAnsi="Calibri"/>
-          <w:sz w:val="22"/>
-        </w:rPr>
-        <w:t xml:space="preserve">, and </w:t>
-      </w:r>
-      <w:r>
-        <w:rPr>
-          <w:rFonts w:ascii="Consolas" w:hAnsi="Consolas"/>
-          <w:color w:val="1F4D78"/>
-          <w:sz w:val="19"/>
-        </w:rPr>
-        <w:t>very</w:t>
-      </w:r>
-      <w:r>
-        <w:rPr>
-          <w:rFonts w:ascii="Calibri" w:hAnsi="Calibri"/>
-          <w:sz w:val="22"/>
-        </w:rPr>
-        <w:t>.</w:t>
-      </w:r>
-    </w:p>
-    <w:p>
-      <w:pPr>
-        <w:pStyle w:val="Heading2"/>
-      </w:pPr>
-      <w:r>
-        <w:rPr>
-          <w:rFonts w:ascii="Calibri" w:hAnsi="Calibri"/>
-          <w:sz w:val="22"/>
-        </w:rPr>
-        <w:t>Custom Stopword</w:t>
-      </w:r>
-    </w:p>
-    <w:p>
-      <w:pPr>
-        <w:widowControl/>
-        <w:spacing w:before="0" w:after="120" w:line="300" w:lineRule="auto"/>
-      </w:pPr>
-      <w:r>
-        <w:rPr>
-          <w:rFonts w:ascii="Calibri" w:hAnsi="Calibri"/>
-          <w:sz w:val="22"/>
-        </w:rPr>
-        <w:t xml:space="preserve">A </w:t>
-      </w:r>
-      <w:r>
-        <w:rPr>
-          <w:rFonts w:ascii="Calibri" w:hAnsi="Calibri"/>
-          <w:b/>
-          <w:sz w:val="22"/>
-        </w:rPr>
-        <w:t>custom stopword</w:t>
-      </w:r>
-      <w:r>
-        <w:rPr>
-          <w:rFonts w:ascii="Calibri" w:hAnsi="Calibri"/>
-          <w:sz w:val="22"/>
-        </w:rPr>
-        <w:t xml:space="preserve"> is a word the user deliberately adds to the active stopword list for a specific analytical purpose. For example, adding </w:t>
-      </w:r>
-      <w:r>
-        <w:rPr>
-          <w:rFonts w:ascii="Consolas" w:hAnsi="Consolas"/>
-          <w:color w:val="1F4D78"/>
-          <w:sz w:val="19"/>
-        </w:rPr>
-        <w:t>raven</w:t>
-      </w:r>
-      <w:r>
-        <w:rPr>
-          <w:rFonts w:ascii="Calibri" w:hAnsi="Calibri"/>
-          <w:sz w:val="22"/>
-        </w:rPr>
-        <w:t xml:space="preserve"> would make matches to </w:t>
-      </w:r>
-      <w:r>
-        <w:rPr>
-          <w:rFonts w:ascii="Consolas" w:hAnsi="Consolas"/>
-          <w:color w:val="1F4D78"/>
-          <w:sz w:val="19"/>
-        </w:rPr>
-        <w:t>raven</w:t>
-      </w:r>
-      <w:r>
-        <w:rPr>
-          <w:rFonts w:ascii="Calibri" w:hAnsi="Calibri"/>
-          <w:sz w:val="22"/>
-        </w:rPr>
-        <w:t xml:space="preserve"> absent from the stopword-excluded aggregate while preserving them in the all-matched result and audit.</w:t>
-      </w:r>
-    </w:p>
-    <w:p>
-      <w:pPr>
-        <w:widowControl/>
-        <w:spacing w:before="0" w:after="120" w:line="300" w:lineRule="auto"/>
-      </w:pPr>
-      <w:r>
-        <w:rPr>
-          <w:rFonts w:ascii="Calibri" w:hAnsi="Calibri"/>
-          <w:sz w:val="22"/>
-        </w:rPr>
-        <w:t>This is a methodological decision, not a declaration that the word is universally unimportant.</w:t>
-      </w:r>
-    </w:p>
-    <w:p>
-      <w:pPr>
-        <w:pStyle w:val="Heading2"/>
-      </w:pPr>
-      <w:r>
-        <w:rPr>
-          <w:rFonts w:ascii="Calibri" w:hAnsi="Calibri"/>
-          <w:sz w:val="22"/>
-        </w:rPr>
-        <w:t>Content-Focused Coverage</w:t>
-      </w:r>
-    </w:p>
-    <w:p>
-      <w:pPr>
-        <w:pStyle w:val="Formula"/>
-      </w:pPr>
-      <w:r>
-        <w:rPr>
-          <w:rFonts w:ascii="Consolas" w:hAnsi="Consolas"/>
-          <w:color w:val="1F4D78"/>
-          <w:sz w:val="19"/>
-        </w:rPr>
-        <w:t>content_coverage = matched eligible non-stopword token positions / eligible non-stopword token positions</w:t>
-      </w:r>
-    </w:p>
-    <w:p>
-      <w:pPr>
-        <w:widowControl/>
-        <w:spacing w:before="0" w:after="120" w:line="300" w:lineRule="auto"/>
-      </w:pPr>
-      <w:r>
-        <w:rPr>
-          <w:rFonts w:ascii="Calibri" w:hAnsi="Calibri"/>
-          <w:sz w:val="22"/>
-        </w:rPr>
-        <w:t>Content-focused coverage belongs to the stopword-excluded view. It should not be substituted silently for ordinary coverage.</w:t>
-      </w:r>
-    </w:p>
-    <w:p>
-      <w:pPr>
-        <w:pStyle w:val="Heading1"/>
-      </w:pPr>
-      <w:r>
-        <w:rPr>
-          <w:rFonts w:ascii="Calibri" w:hAnsi="Calibri"/>
-          <w:sz w:val="22"/>
-        </w:rPr>
-        <w:t>9. Token-Weighted and Type-Weighted Statistics</w:t>
-      </w:r>
-    </w:p>
-    <w:p>
-      <w:pPr>
-        <w:pStyle w:val="Heading2"/>
-      </w:pPr>
-      <w:r>
-        <w:rPr>
-          <w:rFonts w:ascii="Calibri" w:hAnsi="Calibri"/>
-          <w:sz w:val="22"/>
-        </w:rPr>
-        <w:t>Token-Weighted</w:t>
-      </w:r>
-    </w:p>
-    <w:p>
-      <w:pPr>
-        <w:widowControl/>
-        <w:spacing w:before="0" w:after="120" w:line="300" w:lineRule="auto"/>
-      </w:pPr>
-      <w:r>
-        <w:rPr>
-          <w:rFonts w:ascii="Calibri" w:hAnsi="Calibri"/>
-          <w:sz w:val="22"/>
-        </w:rPr>
-        <w:t xml:space="preserve">In a </w:t>
-      </w:r>
-      <w:r>
-        <w:rPr>
-          <w:rFonts w:ascii="Calibri" w:hAnsi="Calibri"/>
-          <w:b/>
-          <w:sz w:val="22"/>
-        </w:rPr>
-        <w:t>token-weighted</w:t>
-      </w:r>
-      <w:r>
-        <w:rPr>
-          <w:rFonts w:ascii="Calibri" w:hAnsi="Calibri"/>
-          <w:sz w:val="22"/>
-        </w:rPr>
-        <w:t xml:space="preserve"> statistic, every included occurrence contributes.</w:t>
-      </w:r>
-    </w:p>
-    <w:p>
-      <w:pPr>
-        <w:pStyle w:val="Formula"/>
-      </w:pPr>
-      <w:r>
-        <w:rPr>
-          <w:rFonts w:ascii="Consolas" w:hAnsi="Consolas"/>
-          <w:color w:val="1F4D78"/>
-          <w:sz w:val="19"/>
-        </w:rPr>
-        <w:t>mean_token = sum(x_i) / N</w:t>
-      </w:r>
-    </w:p>
-    <w:p>
-      <w:pPr>
-        <w:widowControl/>
-        <w:spacing w:before="0" w:after="120" w:line="300" w:lineRule="auto"/>
-      </w:pPr>
-      <w:r>
-        <w:rPr>
-          <w:rFonts w:ascii="Calibri" w:hAnsi="Calibri"/>
-          <w:sz w:val="22"/>
-        </w:rPr>
-        <w:t xml:space="preserve">where </w:t>
-      </w:r>
-      <w:r>
-        <w:rPr>
-          <w:rFonts w:ascii="Consolas" w:hAnsi="Consolas"/>
-          <w:color w:val="1F4D78"/>
-          <w:sz w:val="19"/>
-        </w:rPr>
-        <w:t>x_i</w:t>
-      </w:r>
-      <w:r>
-        <w:rPr>
-          <w:rFonts w:ascii="Calibri" w:hAnsi="Calibri"/>
-          <w:sz w:val="22"/>
-        </w:rPr>
-        <w:t xml:space="preserve"> is the rating of included occurrence </w:t>
-      </w:r>
-      <w:r>
-        <w:rPr>
-          <w:rFonts w:ascii="Consolas" w:hAnsi="Consolas"/>
-          <w:color w:val="1F4D78"/>
-          <w:sz w:val="19"/>
-        </w:rPr>
-        <w:t>i</w:t>
-      </w:r>
-      <w:r>
-        <w:rPr>
-          <w:rFonts w:ascii="Calibri" w:hAnsi="Calibri"/>
-          <w:sz w:val="22"/>
-        </w:rPr>
-        <w:t xml:space="preserve"> and </w:t>
-      </w:r>
-      <w:r>
-        <w:rPr>
-          <w:rFonts w:ascii="Consolas" w:hAnsi="Consolas"/>
-          <w:color w:val="1F4D78"/>
-          <w:sz w:val="19"/>
-        </w:rPr>
-        <w:t>N</w:t>
-      </w:r>
-      <w:r>
-        <w:rPr>
-          <w:rFonts w:ascii="Calibri" w:hAnsi="Calibri"/>
-          <w:sz w:val="22"/>
-        </w:rPr>
-        <w:t xml:space="preserve"> is the number of included matched observations.</w:t>
-      </w:r>
-    </w:p>
-    <w:p>
-      <w:pPr>
-        <w:widowControl/>
-        <w:spacing w:before="0" w:after="120" w:line="300" w:lineRule="auto"/>
-      </w:pPr>
-      <w:r>
-        <w:rPr>
-          <w:rFonts w:ascii="Calibri" w:hAnsi="Calibri"/>
-          <w:sz w:val="22"/>
-        </w:rPr>
-        <w:t>Question answered: “What affective ratings does a reader encounter across the matched words and accepted phrases, including repetition?”</w:t>
-      </w:r>
-    </w:p>
-    <w:p>
-      <w:pPr>
-        <w:widowControl/>
-        <w:spacing w:before="0" w:after="120" w:line="300" w:lineRule="auto"/>
-      </w:pPr>
-      <w:r>
-        <w:rPr>
-          <w:rFonts w:ascii="Calibri" w:hAnsi="Calibri"/>
-          <w:sz w:val="22"/>
-        </w:rPr>
-        <w:t>Use token weighting when repetition and textual exposure matter.</w:t>
-      </w:r>
-    </w:p>
-    <w:p>
-      <w:pPr>
-        <w:pStyle w:val="Heading2"/>
-      </w:pPr>
-      <w:r>
-        <w:rPr>
-          <w:rFonts w:ascii="Calibri" w:hAnsi="Calibri"/>
-          <w:sz w:val="22"/>
-        </w:rPr>
-        <w:t>Type-Weighted</w:t>
-      </w:r>
-    </w:p>
-    <w:p>
-      <w:pPr>
-        <w:widowControl/>
-        <w:spacing w:before="0" w:after="120" w:line="300" w:lineRule="auto"/>
-      </w:pPr>
-      <w:r>
-        <w:rPr>
-          <w:rFonts w:ascii="Calibri" w:hAnsi="Calibri"/>
-          <w:sz w:val="22"/>
-        </w:rPr>
-        <w:t xml:space="preserve">In a </w:t>
-      </w:r>
-      <w:r>
-        <w:rPr>
-          <w:rFonts w:ascii="Calibri" w:hAnsi="Calibri"/>
-          <w:b/>
-          <w:sz w:val="22"/>
-        </w:rPr>
-        <w:t>type-weighted</w:t>
-      </w:r>
-      <w:r>
-        <w:rPr>
-          <w:rFonts w:ascii="Calibri" w:hAnsi="Calibri"/>
-          <w:sz w:val="22"/>
-        </w:rPr>
-        <w:t xml:space="preserve"> statistic, every distinct matched lexicon entry contributes once.</w:t>
-      </w:r>
-    </w:p>
-    <w:p>
-      <w:pPr>
-        <w:pStyle w:val="Formula"/>
-      </w:pPr>
-      <w:r>
-        <w:rPr>
-          <w:rFonts w:ascii="Consolas" w:hAnsi="Consolas"/>
-          <w:color w:val="1F4D78"/>
-          <w:sz w:val="19"/>
-        </w:rPr>
-        <w:t>mean_type = sum(x_t) / T</w:t>
-      </w:r>
-    </w:p>
-    <w:p>
-      <w:pPr>
-        <w:widowControl/>
-        <w:spacing w:before="0" w:after="120" w:line="300" w:lineRule="auto"/>
-      </w:pPr>
-      <w:r>
-        <w:rPr>
-          <w:rFonts w:ascii="Calibri" w:hAnsi="Calibri"/>
-          <w:sz w:val="22"/>
-        </w:rPr>
-        <w:t xml:space="preserve">where </w:t>
-      </w:r>
-      <w:r>
-        <w:rPr>
-          <w:rFonts w:ascii="Consolas" w:hAnsi="Consolas"/>
-          <w:color w:val="1F4D78"/>
-          <w:sz w:val="19"/>
-        </w:rPr>
-        <w:t>x_t</w:t>
-      </w:r>
-      <w:r>
-        <w:rPr>
-          <w:rFonts w:ascii="Calibri" w:hAnsi="Calibri"/>
-          <w:sz w:val="22"/>
-        </w:rPr>
-        <w:t xml:space="preserve"> is the rating for distinct matched entry </w:t>
-      </w:r>
-      <w:r>
-        <w:rPr>
-          <w:rFonts w:ascii="Consolas" w:hAnsi="Consolas"/>
-          <w:color w:val="1F4D78"/>
-          <w:sz w:val="19"/>
-        </w:rPr>
-        <w:t>t</w:t>
-      </w:r>
-      <w:r>
-        <w:rPr>
-          <w:rFonts w:ascii="Calibri" w:hAnsi="Calibri"/>
-          <w:sz w:val="22"/>
-        </w:rPr>
-        <w:t xml:space="preserve"> and </w:t>
-      </w:r>
-      <w:r>
-        <w:rPr>
-          <w:rFonts w:ascii="Consolas" w:hAnsi="Consolas"/>
-          <w:color w:val="1F4D78"/>
-          <w:sz w:val="19"/>
-        </w:rPr>
-        <w:t>T</w:t>
-      </w:r>
-      <w:r>
-        <w:rPr>
-          <w:rFonts w:ascii="Calibri" w:hAnsi="Calibri"/>
-          <w:sz w:val="22"/>
-        </w:rPr>
-        <w:t xml:space="preserve"> is the number of distinct included matched entries.</w:t>
-      </w:r>
-    </w:p>
-    <w:p>
-      <w:pPr>
-        <w:widowControl/>
-        <w:spacing w:before="0" w:after="120" w:line="300" w:lineRule="auto"/>
-      </w:pPr>
-      <w:r>
-        <w:rPr>
-          <w:rFonts w:ascii="Calibri" w:hAnsi="Calibri"/>
-          <w:sz w:val="22"/>
-        </w:rPr>
-        <w:t>Question answered: “What is the profile of the distinct matched vocabulary inventory if repeated entries count only once?”</w:t>
-      </w:r>
-    </w:p>
-    <w:p>
-      <w:pPr>
-        <w:widowControl/>
-        <w:spacing w:before="0" w:after="120" w:line="300" w:lineRule="auto"/>
-      </w:pPr>
-      <w:r>
-        <w:rPr>
-          <w:rFonts w:ascii="Calibri" w:hAnsi="Calibri"/>
-          <w:sz w:val="22"/>
-        </w:rPr>
-        <w:t>Use type weighting to reduce the influence of repetition.</w:t>
-      </w:r>
-    </w:p>
-    <w:p>
-      <w:pPr>
-        <w:pStyle w:val="Heading2"/>
-      </w:pPr>
-      <w:r>
-        <w:rPr>
-          <w:rFonts w:ascii="Calibri" w:hAnsi="Calibri"/>
-          <w:sz w:val="22"/>
-        </w:rPr>
-        <w:t>Interpreting Their Difference</w:t>
-      </w:r>
-    </w:p>
-    <w:p>
-      <w:pPr>
-        <w:widowControl/>
-        <w:spacing w:before="0" w:after="120" w:line="300" w:lineRule="auto"/>
-      </w:pPr>
-      <w:r>
-        <w:rPr>
-          <w:rFonts w:ascii="Calibri" w:hAnsi="Calibri"/>
-          <w:sz w:val="22"/>
-        </w:rPr>
-        <w:t>If token- and type-weighted means are close, repetition changes the reported center little. If they diverge, repeated entries shift the token-weighted profile away from the distinct-vocabulary profile.</w:t>
-      </w:r>
-    </w:p>
-    <w:p>
-      <w:pPr>
-        <w:widowControl/>
-        <w:spacing w:before="0" w:after="120" w:line="300" w:lineRule="auto"/>
-      </w:pPr>
-      <w:r>
-        <w:rPr>
-          <w:rFonts w:ascii="Calibri" w:hAnsi="Calibri"/>
-          <w:sz w:val="22"/>
-        </w:rPr>
-        <w:t>Neither weighting is automatically superior. They answer different questions and should be named explicitly.</w:t>
-      </w:r>
-    </w:p>
-    <w:p>
-      <w:pPr>
-        <w:pStyle w:val="Heading1"/>
-      </w:pPr>
-      <w:r>
-        <w:rPr>
-          <w:rFonts w:ascii="Calibri" w:hAnsi="Calibri"/>
-          <w:sz w:val="22"/>
-        </w:rPr>
-        <w:t>10. Means, Medians, and Dispersion</w:t>
-      </w:r>
-    </w:p>
-    <w:p>
-      <w:pPr>
-        <w:pStyle w:val="Heading2"/>
-      </w:pPr>
-      <w:r>
-        <w:rPr>
-          <w:rFonts w:ascii="Calibri" w:hAnsi="Calibri"/>
-          <w:sz w:val="22"/>
-        </w:rPr>
-        <w:t>Mean</w:t>
-      </w:r>
-    </w:p>
-    <w:p>
-      <w:pPr>
-        <w:widowControl/>
-        <w:spacing w:before="0" w:after="120" w:line="300" w:lineRule="auto"/>
-      </w:pPr>
-      <w:r>
-        <w:rPr>
-          <w:rFonts w:ascii="Calibri" w:hAnsi="Calibri"/>
-          <w:sz w:val="22"/>
-        </w:rPr>
-        <w:t xml:space="preserve">The </w:t>
-      </w:r>
-      <w:r>
-        <w:rPr>
-          <w:rFonts w:ascii="Calibri" w:hAnsi="Calibri"/>
-          <w:b/>
-          <w:sz w:val="22"/>
-        </w:rPr>
-        <w:t>mean</w:t>
-      </w:r>
-      <w:r>
-        <w:rPr>
-          <w:rFonts w:ascii="Calibri" w:hAnsi="Calibri"/>
-          <w:sz w:val="22"/>
-        </w:rPr>
-        <w:t xml:space="preserve"> is the arithmetic average of the included values.</w:t>
-      </w:r>
-    </w:p>
-    <w:p>
-      <w:pPr>
-        <w:pStyle w:val="Formula"/>
-      </w:pPr>
-      <w:r>
-        <w:rPr>
-          <w:rFonts w:ascii="Consolas" w:hAnsi="Consolas"/>
-          <w:color w:val="1F4D78"/>
-          <w:sz w:val="19"/>
-        </w:rPr>
-        <w:t>mean = sum(values) / number_of_values</w:t>
-      </w:r>
-    </w:p>
-    <w:p>
-      <w:pPr>
-        <w:widowControl/>
-        <w:spacing w:before="0" w:after="120" w:line="300" w:lineRule="auto"/>
-      </w:pPr>
-      <w:r>
-        <w:rPr>
-          <w:rFonts w:ascii="Calibri" w:hAnsi="Calibri"/>
-          <w:sz w:val="22"/>
-        </w:rPr>
-        <w:t>A mean identifies a center. It does not show whether the values cluster tightly or contain strong values on both sides.</w:t>
-      </w:r>
-    </w:p>
-    <w:p>
-      <w:pPr>
-        <w:pStyle w:val="Heading2"/>
-      </w:pPr>
-      <w:r>
-        <w:rPr>
-          <w:rFonts w:ascii="Calibri" w:hAnsi="Calibri"/>
-          <w:sz w:val="22"/>
-        </w:rPr>
-        <w:t>Median</w:t>
-      </w:r>
-    </w:p>
-    <w:p>
-      <w:pPr>
-        <w:widowControl/>
-        <w:spacing w:before="0" w:after="120" w:line="300" w:lineRule="auto"/>
-      </w:pPr>
-      <w:r>
-        <w:rPr>
-          <w:rFonts w:ascii="Calibri" w:hAnsi="Calibri"/>
-          <w:sz w:val="22"/>
-        </w:rPr>
-        <w:t xml:space="preserve">The </w:t>
-      </w:r>
-      <w:r>
-        <w:rPr>
-          <w:rFonts w:ascii="Calibri" w:hAnsi="Calibri"/>
-          <w:b/>
-          <w:sz w:val="22"/>
-        </w:rPr>
-        <w:t>median</w:t>
-      </w:r>
-      <w:r>
-        <w:rPr>
-          <w:rFonts w:ascii="Calibri" w:hAnsi="Calibri"/>
-          <w:sz w:val="22"/>
-        </w:rPr>
-        <w:t xml:space="preserve"> is the middle value after sorting. For an even number of values, it is the mean of the two middle values. It is less sensitive than the mean to a small number of extreme values.</w:t>
-      </w:r>
-    </w:p>
-    <w:p>
-      <w:pPr>
-        <w:widowControl/>
-        <w:spacing w:before="0" w:after="120" w:line="300" w:lineRule="auto"/>
-      </w:pPr>
-      <w:r>
-        <w:rPr>
-          <w:rFonts w:ascii="Calibri" w:hAnsi="Calibri"/>
-          <w:sz w:val="22"/>
-        </w:rPr>
-        <w:t>For concreteness, VerseVAD applies the same mean and median definitions to the source 1-5 ratings assigned to included lexical-token positions. Empty or wholly unmatched inputs have missing aggregates, never a neutral midpoint.</w:t>
-      </w:r>
-    </w:p>
-    <w:p>
-      <w:pPr>
-        <w:pStyle w:val="Heading2"/>
-      </w:pPr>
-      <w:r>
-        <w:rPr>
-          <w:rFonts w:ascii="Calibri" w:hAnsi="Calibri"/>
-          <w:sz w:val="22"/>
-        </w:rPr>
-        <w:t>Dispersion of Matched Ratings</w:t>
-      </w:r>
-    </w:p>
-    <w:p>
-      <w:pPr>
-        <w:widowControl/>
-        <w:spacing w:before="0" w:after="120" w:line="300" w:lineRule="auto"/>
-      </w:pPr>
-      <w:r>
-        <w:rPr>
-          <w:rFonts w:ascii="Calibri" w:hAnsi="Calibri"/>
-          <w:b/>
-          <w:sz w:val="22"/>
-        </w:rPr>
-        <w:t>Dispersion</w:t>
-      </w:r>
-      <w:r>
-        <w:rPr>
-          <w:rFonts w:ascii="Calibri" w:hAnsi="Calibri"/>
-          <w:sz w:val="22"/>
-        </w:rPr>
-        <w:t xml:space="preserve"> describes how spread out the included matched ratings are around their center.</w:t>
-      </w:r>
-    </w:p>
-    <w:p>
-      <w:pPr>
-        <w:widowControl/>
-        <w:spacing w:before="0" w:after="120" w:line="300" w:lineRule="auto"/>
-      </w:pPr>
-      <w:r>
-        <w:rPr>
-          <w:rFonts w:ascii="Calibri" w:hAnsi="Calibri"/>
-          <w:sz w:val="22"/>
-        </w:rPr>
-        <w:t xml:space="preserve">VerseVAD reports </w:t>
-      </w:r>
-      <w:r>
-        <w:rPr>
-          <w:rFonts w:ascii="Calibri" w:hAnsi="Calibri"/>
-          <w:b/>
-          <w:sz w:val="22"/>
-        </w:rPr>
-        <w:t>population standard deviation</w:t>
-      </w:r>
-      <w:r>
-        <w:rPr>
-          <w:rFonts w:ascii="Calibri" w:hAnsi="Calibri"/>
-          <w:sz w:val="22"/>
-        </w:rPr>
-        <w:t xml:space="preserve"> for the complete selected matched set:</w:t>
-      </w:r>
-    </w:p>
-    <w:p>
-      <w:pPr>
-        <w:pStyle w:val="Formula"/>
-      </w:pPr>
-      <w:r>
-        <w:rPr>
-          <w:rFonts w:ascii="Consolas" w:hAnsi="Consolas"/>
-          <w:color w:val="1F4D78"/>
-          <w:sz w:val="19"/>
-        </w:rPr>
-        <w:t>SD_population = sqrt(sum((x_i - mean)^2) / N)</w:t>
-      </w:r>
-    </w:p>
-    <w:p>
-      <w:pPr>
-        <w:widowControl/>
-        <w:spacing w:before="0" w:after="120" w:line="300" w:lineRule="auto"/>
-      </w:pPr>
-      <w:r>
-        <w:rPr>
-          <w:rFonts w:ascii="Calibri" w:hAnsi="Calibri"/>
-          <w:sz w:val="22"/>
-        </w:rPr>
-        <w:t>A standard deviation near 0 means the included ratings are tightly clustered. A larger standard deviation means they are more dispersed.</w:t>
-      </w:r>
-    </w:p>
-    <w:p>
-      <w:pPr>
-        <w:widowControl/>
-        <w:spacing w:before="0" w:after="120" w:line="300" w:lineRule="auto"/>
-      </w:pPr>
-      <w:r>
-        <w:rPr>
-          <w:rFonts w:ascii="Calibri" w:hAnsi="Calibri"/>
-          <w:sz w:val="22"/>
-        </w:rPr>
-        <w:t>On the normalized 0-to-1 scale, possible population SD values are bounded, but there is no universal literary threshold for “small” or “large.” Compare like with like: same construct, lexicon, scale, view, weighting, and unit of analysis.</w:t>
-      </w:r>
-    </w:p>
-    <w:p>
-      <w:pPr>
-        <w:pStyle w:val="Heading2"/>
-      </w:pPr>
-      <w:r>
-        <w:rPr>
-          <w:rFonts w:ascii="Calibri" w:hAnsi="Calibri"/>
-          <w:sz w:val="22"/>
-        </w:rPr>
-        <w:t>What Dispersion Does Not Mean</w:t>
-      </w:r>
-    </w:p>
-    <w:p>
-      <w:pPr>
-        <w:widowControl/>
-        <w:spacing w:before="0" w:after="120" w:line="300" w:lineRule="auto"/>
-      </w:pPr>
-      <w:r>
-        <w:rPr>
-          <w:rFonts w:ascii="Calibri" w:hAnsi="Calibri"/>
-          <w:sz w:val="22"/>
-        </w:rPr>
-        <w:t>Work-level dispersion is not:</w:t>
+          <w:sz w:val="22"/>
+        </w:rPr>
+        <w:t>a confidence interval;</w:t>
       </w:r>
     </w:p>
     <w:p>
@@ -10399,7 +10460,7 @@
           <w:rFonts w:ascii="Calibri" w:hAnsi="Calibri"/>
           <w:sz w:val="22"/>
         </w:rPr>
-        <w:t>the uncertainty of the work mean;</w:t>
+        <w:t>statistical significance;</w:t>
       </w:r>
     </w:p>
     <w:p>
@@ -10417,7 +10478,7 @@
           <w:rFonts w:ascii="Calibri" w:hAnsi="Calibri"/>
           <w:sz w:val="22"/>
         </w:rPr>
-        <w:t>a confidence interval;</w:t>
+        <w:t>disagreement among lexicon raters;</w:t>
       </w:r>
     </w:p>
     <w:p>
@@ -10435,42 +10496,6 @@
           <w:rFonts w:ascii="Calibri" w:hAnsi="Calibri"/>
           <w:sz w:val="22"/>
         </w:rPr>
-        <w:t>statistical significance;</w:t>
-      </w:r>
-    </w:p>
-    <w:p>
-      <w:pPr>
-        <w:widowControl/>
-        <w:numPr>
-          <w:ilvl w:val="0"/>
-          <w:numId w:val="10"/>
-        </w:numPr>
-        <w:spacing w:before="0" w:after="80" w:line="300" w:lineRule="auto"/>
-        <w:ind w:left="540" w:hanging="271"/>
-      </w:pPr>
-      <w:r>
-        <w:rPr>
-          <w:rFonts w:ascii="Calibri" w:hAnsi="Calibri"/>
-          <w:sz w:val="22"/>
-        </w:rPr>
-        <w:t>disagreement among lexicon raters;</w:t>
-      </w:r>
-    </w:p>
-    <w:p>
-      <w:pPr>
-        <w:widowControl/>
-        <w:numPr>
-          <w:ilvl w:val="0"/>
-          <w:numId w:val="10"/>
-        </w:numPr>
-        <w:spacing w:before="0" w:after="80" w:line="300" w:lineRule="auto"/>
-        <w:ind w:left="540" w:hanging="271"/>
-      </w:pPr>
-      <w:r>
-        <w:rPr>
-          <w:rFonts w:ascii="Calibri" w:hAnsi="Calibri"/>
-          <w:sz w:val="22"/>
-        </w:rPr>
         <w:t>ambiguity in the poem.</w:t>
       </w:r>
     </w:p>
@@ -10511,7 +10536,7 @@
           <w:rFonts w:ascii="Calibri" w:hAnsi="Calibri"/>
           <w:sz w:val="22"/>
         </w:rPr>
-        <w:t>11. Stopword Sensitivity</w:t>
+        <w:t>11. Comparing Report Profiles</w:t>
       </w:r>
     </w:p>
     <w:p>
@@ -10522,17 +10547,9 @@
       <w:r>
         <w:rPr>
           <w:rFonts w:ascii="Calibri" w:hAnsi="Calibri"/>
-          <w:b/>
-          <w:sz w:val="22"/>
-        </w:rPr>
-        <w:t>Stopword sensitivity</w:t>
-      </w:r>
-      <w:r>
-        <w:rPr>
-          <w:rFonts w:ascii="Calibri" w:hAnsi="Calibri"/>
-          <w:sz w:val="22"/>
-        </w:rPr>
-        <w:t xml:space="preserve"> reports how much a statistic changes when moving from all matched observations to the stopword-excluded view.</w:t>
+          <w:sz w:val="22"/>
+        </w:rPr>
+        <w:t>VerseVAD presents selected scope/weighting combinations directly rather than adding a redundant sensitivity score. A researcher may calculate a contrast from two explicitly named rows:</w:t>
       </w:r>
     </w:p>
     <w:p>
@@ -10545,283 +10562,8 @@
           <w:color w:val="1F4D78"/>
           <w:sz w:val="19"/>
         </w:rPr>
-        <w:t>sensitivity = stopwords_excluded_value - all_matched_value</w:t>
-      </w:r>
-    </w:p>
-    <w:tbl>
-      <w:tblPr>
-        <w:tblStyle w:val="TableGrid"/>
-        <w:tblW w:type="dxa" w:w="9360"/>
-        <w:jc w:val="left"/>
-        <w:tblLayout w:type="fixed"/>
-        <w:tblLook w:firstColumn="1" w:firstRow="1" w:lastColumn="0" w:lastRow="0" w:noHBand="0" w:noVBand="1" w:val="04A0"/>
-        <w:tblInd w:w="120" w:type="dxa"/>
-        <w:tblBorders>
-          <w:top w:val="single" w:sz="4" w:space="0" w:color="C9D1D8"/>
-          <w:left w:val="single" w:sz="4" w:space="0" w:color="C9D1D8"/>
-          <w:bottom w:val="single" w:sz="4" w:space="0" w:color="C9D1D8"/>
-          <w:right w:val="single" w:sz="4" w:space="0" w:color="C9D1D8"/>
-          <w:insideH w:val="single" w:sz="4" w:space="0" w:color="C9D1D8"/>
-          <w:insideV w:val="single" w:sz="4" w:space="0" w:color="C9D1D8"/>
-        </w:tblBorders>
-      </w:tblPr>
-      <w:tblGrid>
-        <w:gridCol w:w="2700"/>
-        <w:gridCol w:w="6660"/>
-      </w:tblGrid>
-      <w:tr>
-        <w:trPr>
-          <w:cantSplit w:val="true"/>
-          <w:tblHeader w:val="true"/>
-        </w:trPr>
-        <w:tc>
-          <w:tcPr>
-            <w:tcW w:type="dxa" w:w="2700"/>
-            <w:vAlign w:val="center"/>
-            <w:tcMar>
-              <w:top w:w="80" w:type="dxa"/>
-              <w:bottom w:w="80" w:type="dxa"/>
-              <w:start w:w="120" w:type="dxa"/>
-              <w:end w:w="120" w:type="dxa"/>
-            </w:tcMar>
-            <w:shd w:fill="E8EEF5"/>
-          </w:tcPr>
-          <w:p>
-            <w:pPr>
-              <w:keepNext/>
-              <w:widowControl/>
-              <w:spacing w:before="0" w:after="0" w:line="252" w:lineRule="auto"/>
-            </w:pPr>
-            <w:r>
-              <w:rPr>
-                <w:b/>
-                <w:color w:val="193247"/>
-              </w:rPr>
-            </w:r>
-            <w:r>
-              <w:rPr>
-                <w:rFonts w:ascii="Calibri" w:hAnsi="Calibri"/>
-                <w:b/>
-                <w:color w:val="193247"/>
-                <w:sz w:val="18"/>
-              </w:rPr>
-              <w:t>Sign</w:t>
-            </w:r>
-          </w:p>
-        </w:tc>
-        <w:tc>
-          <w:tcPr>
-            <w:tcW w:type="dxa" w:w="6660"/>
-            <w:vAlign w:val="center"/>
-            <w:tcMar>
-              <w:top w:w="80" w:type="dxa"/>
-              <w:bottom w:w="80" w:type="dxa"/>
-              <w:start w:w="120" w:type="dxa"/>
-              <w:end w:w="120" w:type="dxa"/>
-            </w:tcMar>
-            <w:shd w:fill="E8EEF5"/>
-          </w:tcPr>
-          <w:p>
-            <w:pPr>
-              <w:keepNext/>
-              <w:widowControl/>
-              <w:spacing w:before="0" w:after="0" w:line="252" w:lineRule="auto"/>
-            </w:pPr>
-            <w:r>
-              <w:rPr>
-                <w:b/>
-                <w:color w:val="193247"/>
-              </w:rPr>
-            </w:r>
-            <w:r>
-              <w:rPr>
-                <w:rFonts w:ascii="Calibri" w:hAnsi="Calibri"/>
-                <w:b/>
-                <w:color w:val="193247"/>
-                <w:sz w:val="18"/>
-              </w:rPr>
-              <w:t>Meaning</w:t>
-            </w:r>
-          </w:p>
-        </w:tc>
-      </w:tr>
-      <w:tr>
-        <w:trPr>
-          <w:cantSplit w:val="true"/>
-        </w:trPr>
-        <w:tc>
-          <w:tcPr>
-            <w:tcW w:type="dxa" w:w="2700"/>
-            <w:vAlign w:val="center"/>
-            <w:tcMar>
-              <w:top w:w="80" w:type="dxa"/>
-              <w:bottom w:w="80" w:type="dxa"/>
-              <w:start w:w="120" w:type="dxa"/>
-              <w:end w:w="120" w:type="dxa"/>
-            </w:tcMar>
-          </w:tcPr>
-          <w:p>
-            <w:pPr>
-              <w:widowControl/>
-              <w:spacing w:before="0" w:after="0" w:line="252" w:lineRule="auto"/>
-            </w:pPr>
-            <w:r/>
-            <w:r>
-              <w:rPr>
-                <w:rFonts w:ascii="Calibri" w:hAnsi="Calibri"/>
-                <w:sz w:val="18"/>
-              </w:rPr>
-              <w:t>Positive</w:t>
-            </w:r>
-          </w:p>
-        </w:tc>
-        <w:tc>
-          <w:tcPr>
-            <w:tcW w:type="dxa" w:w="6660"/>
-            <w:vAlign w:val="center"/>
-            <w:tcMar>
-              <w:top w:w="80" w:type="dxa"/>
-              <w:bottom w:w="80" w:type="dxa"/>
-              <w:start w:w="120" w:type="dxa"/>
-              <w:end w:w="120" w:type="dxa"/>
-            </w:tcMar>
-          </w:tcPr>
-          <w:p>
-            <w:pPr>
-              <w:widowControl/>
-              <w:spacing w:before="0" w:after="0" w:line="252" w:lineRule="auto"/>
-            </w:pPr>
-            <w:r/>
-            <w:r>
-              <w:rPr>
-                <w:rFonts w:ascii="Calibri" w:hAnsi="Calibri"/>
-                <w:sz w:val="18"/>
-              </w:rPr>
-              <w:t>The stopword-excluded statistic is higher</w:t>
-            </w:r>
-          </w:p>
-        </w:tc>
-      </w:tr>
-      <w:tr>
-        <w:trPr>
-          <w:cantSplit w:val="true"/>
-        </w:trPr>
-        <w:tc>
-          <w:tcPr>
-            <w:tcW w:type="dxa" w:w="2700"/>
-            <w:vAlign w:val="center"/>
-            <w:tcMar>
-              <w:top w:w="80" w:type="dxa"/>
-              <w:bottom w:w="80" w:type="dxa"/>
-              <w:start w:w="120" w:type="dxa"/>
-              <w:end w:w="120" w:type="dxa"/>
-            </w:tcMar>
-          </w:tcPr>
-          <w:p>
-            <w:pPr>
-              <w:widowControl/>
-              <w:spacing w:before="0" w:after="0" w:line="252" w:lineRule="auto"/>
-            </w:pPr>
-            <w:r/>
-            <w:r>
-              <w:rPr>
-                <w:rFonts w:ascii="Calibri" w:hAnsi="Calibri"/>
-                <w:sz w:val="18"/>
-              </w:rPr>
-              <w:t>Negative</w:t>
-            </w:r>
-          </w:p>
-        </w:tc>
-        <w:tc>
-          <w:tcPr>
-            <w:tcW w:type="dxa" w:w="6660"/>
-            <w:vAlign w:val="center"/>
-            <w:tcMar>
-              <w:top w:w="80" w:type="dxa"/>
-              <w:bottom w:w="80" w:type="dxa"/>
-              <w:start w:w="120" w:type="dxa"/>
-              <w:end w:w="120" w:type="dxa"/>
-            </w:tcMar>
-          </w:tcPr>
-          <w:p>
-            <w:pPr>
-              <w:widowControl/>
-              <w:spacing w:before="0" w:after="0" w:line="252" w:lineRule="auto"/>
-            </w:pPr>
-            <w:r/>
-            <w:r>
-              <w:rPr>
-                <w:rFonts w:ascii="Calibri" w:hAnsi="Calibri"/>
-                <w:sz w:val="18"/>
-              </w:rPr>
-              <w:t>The stopword-excluded statistic is lower</w:t>
-            </w:r>
-          </w:p>
-        </w:tc>
-      </w:tr>
-      <w:tr>
-        <w:trPr>
-          <w:cantSplit w:val="true"/>
-        </w:trPr>
-        <w:tc>
-          <w:tcPr>
-            <w:tcW w:type="dxa" w:w="2700"/>
-            <w:vAlign w:val="center"/>
-            <w:tcMar>
-              <w:top w:w="80" w:type="dxa"/>
-              <w:bottom w:w="80" w:type="dxa"/>
-              <w:start w:w="120" w:type="dxa"/>
-              <w:end w:w="120" w:type="dxa"/>
-            </w:tcMar>
-          </w:tcPr>
-          <w:p>
-            <w:pPr>
-              <w:widowControl/>
-              <w:spacing w:before="0" w:after="0" w:line="252" w:lineRule="auto"/>
-            </w:pPr>
-            <w:r/>
-            <w:r>
-              <w:rPr>
-                <w:rFonts w:ascii="Calibri" w:hAnsi="Calibri"/>
-                <w:sz w:val="18"/>
-              </w:rPr>
-              <w:t>Near zero</w:t>
-            </w:r>
-          </w:p>
-        </w:tc>
-        <w:tc>
-          <w:tcPr>
-            <w:tcW w:type="dxa" w:w="6660"/>
-            <w:vAlign w:val="center"/>
-            <w:tcMar>
-              <w:top w:w="80" w:type="dxa"/>
-              <w:bottom w:w="80" w:type="dxa"/>
-              <w:start w:w="120" w:type="dxa"/>
-              <w:end w:w="120" w:type="dxa"/>
-            </w:tcMar>
-          </w:tcPr>
-          <w:p>
-            <w:pPr>
-              <w:widowControl/>
-              <w:spacing w:before="0" w:after="0" w:line="252" w:lineRule="auto"/>
-            </w:pPr>
-            <w:r/>
-            <w:r>
-              <w:rPr>
-                <w:rFonts w:ascii="Calibri" w:hAnsi="Calibri"/>
-                <w:sz w:val="18"/>
-              </w:rPr>
-              <w:t>That statistic changes little under this policy</w:t>
-            </w:r>
-          </w:p>
-        </w:tc>
-      </w:tr>
-    </w:tbl>
-    <w:p>
-      <w:pPr>
-        <w:widowControl/>
-        <w:spacing w:before="0" w:after="60" w:line="240" w:lineRule="auto"/>
-      </w:pPr>
+        <w:t>profile difference = comparison profile value - reference profile value</w:t>
+      </w:r>
     </w:p>
     <w:p>
       <w:pPr>
@@ -10833,20 +10575,7 @@
           <w:rFonts w:ascii="Calibri" w:hAnsi="Calibri"/>
           <w:sz w:val="22"/>
         </w:rPr>
-        <w:t>Use the signed result, its absolute size, the active stopword policy, and both underlying values.</w:t>
-      </w:r>
-    </w:p>
-    <w:p>
-      <w:pPr>
-        <w:widowControl/>
-        <w:spacing w:before="0" w:after="120" w:line="300" w:lineRule="auto"/>
-      </w:pPr>
-      <w:r>
-        <w:rPr>
-          <w:rFonts w:ascii="Calibri" w:hAnsi="Calibri"/>
-          <w:sz w:val="22"/>
-        </w:rPr>
-        <w:t>There is no universal threshold at which a difference becomes “robust,” “significant,” or “important.” Stopword sensitivity is a descriptive comparison, not an inferential test.</w:t>
+        <w:t>The sign indicates direction. There is no universal threshold at which such a difference becomes robust, significant, or important. The same lexicon, metric, scale, phrase policy, and other settings must be held constant.</w:t>
       </w:r>
     </w:p>
     <w:p>
@@ -12644,7 +12373,7 @@
           <w:rFonts w:ascii="Calibri" w:hAnsi="Calibri"/>
           <w:sz w:val="22"/>
         </w:rPr>
-        <w:t>PoetryID profile prevalence is calculated only within one compatible VAD source, analysis view, weighting, and threshold configuration. Its map counts, continuous work positions, and token/type differences do not create one corpus-wide emotional identity.</w:t>
+        <w:t>PoetryID profile prevalence is calculated only within one compatible VAD source, lexical scope, weighting, and threshold configuration. Its map counts, continuous work positions, and token/type differences do not create one corpus-wide emotional identity.</w:t>
       </w:r>
     </w:p>
     <w:p>
@@ -13863,7 +13592,7 @@
           <w:rFonts w:ascii="Calibri" w:hAnsi="Calibri"/>
           <w:sz w:val="22"/>
         </w:rPr>
-        <w:t>Example D: Stopword Sensitivity</w:t>
+        <w:t>Example D: Comparing Lexical Scopes</w:t>
       </w:r>
     </w:p>
     <w:p>
@@ -13876,7 +13605,7 @@
           <w:rFonts w:ascii="Calibri" w:hAnsi="Calibri"/>
           <w:sz w:val="22"/>
         </w:rPr>
-        <w:t xml:space="preserve">Suppose all-matched token-weighted arousal is </w:t>
+        <w:t xml:space="preserve">Suppose All lexical tokens / Token-weighted arousal is </w:t>
       </w:r>
       <w:r>
         <w:rPr>
@@ -13891,7 +13620,7 @@
           <w:rFonts w:ascii="Calibri" w:hAnsi="Calibri"/>
           <w:sz w:val="22"/>
         </w:rPr>
-        <w:t xml:space="preserve"> and stopwords-excluded arousal is </w:t>
+        <w:t xml:space="preserve"> and Stopword-excluded / Token-weighted arousal is </w:t>
       </w:r>
       <w:r>
         <w:rPr>
@@ -13919,7 +13648,7 @@
           <w:color w:val="1F4D78"/>
           <w:sz w:val="19"/>
         </w:rPr>
-        <w:t>sensitivity = 0.54 - 0.48 = +0.06</w:t>
+        <w:t>scope difference = 0.54 - 0.48 = +0.06</w:t>
       </w:r>
     </w:p>
     <w:p>
@@ -13932,7 +13661,7 @@
           <w:rFonts w:ascii="Calibri" w:hAnsi="Calibri"/>
           <w:sz w:val="22"/>
         </w:rPr>
-        <w:t>Interpretation: under this recorded stopword policy, the content-focused arousal mean is 0.06 higher on the normalized scale. The calculation alone does not establish whether that difference is substantively important.</w:t>
+        <w:t>Interpretation: under this recorded stopword policy, the stopword-excluded arousal mean is 0.06 higher on the normalized scale. This is a researcher-made contrast between two report profiles, not a separate VerseVAD metric or an inferential test.</w:t>
       </w:r>
     </w:p>
     <w:p>
@@ -14064,7 +13793,7 @@
           <w:rFonts w:ascii="Calibri" w:hAnsi="Calibri"/>
           <w:sz w:val="22"/>
         </w:rPr>
-        <w:t xml:space="preserve">“Using NRC VAD v2.1 on the normalized 0-to-1 scale, the all-matched token-weighted mean normative valence was 0.61 across 84 included observations, with 78% lexical-token coverage. The type-weighted mean was 0.54, indicating that repetition shifted the occurrence-sensitive profile upward. Population SD was 0.19. The largest above-midpoint contributors were </w:t>
+        <w:t xml:space="preserve">“Using NRC VAD v2.1 on the normalized 0-to-1 scale, the All lexical tokens / Token-weighted mean normative valence was 0.61 across 84 included observations, with 78% lexical-token coverage. The All lexical tokens / Type-weighted mean was 0.54, indicating that repetition shifted the occurrence-sensitive profile upward. Population SD was 0.19. The largest above-midpoint contributors were </w:t>
       </w:r>
       <w:r>
         <w:rPr>
@@ -15136,7 +14865,20 @@
           <w:rFonts w:ascii="Calibri" w:hAnsi="Calibri"/>
           <w:sz w:val="22"/>
         </w:rPr>
-        <w:t>analysis view when applicable: all matched or stopwords excluded;</w:t>
+        <w:t>lexical scope when applicable: all lexical tokens, stopword-excluded, or</w:t>
+      </w:r>
+    </w:p>
+    <w:p>
+      <w:pPr>
+        <w:widowControl/>
+        <w:spacing w:before="0" w:after="120" w:line="300" w:lineRule="auto"/>
+      </w:pPr>
+      <w:r>
+        <w:rPr>
+          <w:rFonts w:ascii="Calibri" w:hAnsi="Calibri"/>
+          <w:sz w:val="22"/>
+        </w:rPr>
+        <w:t xml:space="preserve">  content words only;</w:t>
       </w:r>
     </w:p>
     <w:p>
@@ -15190,7 +14932,7 @@
           <w:rFonts w:ascii="Calibri" w:hAnsi="Calibri"/>
           <w:sz w:val="22"/>
         </w:rPr>
-        <w:t>Frequency or AoA scope when relevant: all lexical tokens or contextual content words only;</w:t>
+        <w:t>report-profile scope and weighting for every compatible lexical metric;</w:t>
       </w:r>
     </w:p>
     <w:p>
@@ -15535,7 +15277,7 @@
           <w:b/>
           <w:sz w:val="22"/>
         </w:rPr>
-        <w:t>[analysis view or optional-module scope when applicable]</w:t>
+        <w:t>[lexical scope or fixed profile]</w:t>
       </w:r>
       <w:r>
         <w:rPr>
@@ -15550,7 +15292,7 @@
           <w:b/>
           <w:sz w:val="22"/>
         </w:rPr>
-        <w:t>[weighting]</w:t>
+        <w:t>[weighting when applicable]</w:t>
       </w:r>
       <w:r>
         <w:rPr>
@@ -15595,7 +15337,7 @@
           <w:b/>
           <w:sz w:val="22"/>
         </w:rPr>
-        <w:t>[Dispersion, contributors, response evidence, relationship, sensitivity, PoetryID boundary/neighbor evidence, or corpus divergence]</w:t>
+        <w:t>[Dispersion, contributors, response evidence, profile contrast, PoetryID boundary/neighbor evidence, or corpus divergence]</w:t>
       </w:r>
       <w:r>
         <w:rPr>
@@ -15911,7 +15653,7 @@
                 <w:rFonts w:ascii="Calibri" w:hAnsi="Calibri"/>
                 <w:sz w:val="18"/>
               </w:rPr>
-              <w:t>Analysis view</w:t>
+              <w:t>Lexical scope</w:t>
             </w:r>
           </w:p>
         </w:tc>
@@ -15937,7 +15679,7 @@
                 <w:rFonts w:ascii="Calibri" w:hAnsi="Calibri"/>
                 <w:sz w:val="18"/>
               </w:rPr>
-              <w:t>All matched observations or stopwords excluded</w:t>
+              <w:t>All lexical tokens, stopword-excluded, or content words only</w:t>
             </w:r>
           </w:p>
         </w:tc>
@@ -16450,7 +16192,7 @@
                 <w:rFonts w:ascii="Calibri" w:hAnsi="Calibri"/>
                 <w:sz w:val="18"/>
               </w:rPr>
-              <w:t>Optional Frequency or AoA contextual scope limited to exact model tags NOUN, VERB, ADJ, and ADV; off by default</w:t>
+              <w:t>Global contextual report scope limited to exact model tags NOUN, VERB, ADJ, and ADV</w:t>
             </w:r>
           </w:p>
         </w:tc>
@@ -19478,7 +19220,7 @@
                 <w:rFonts w:ascii="Calibri" w:hAnsi="Calibri"/>
                 <w:sz w:val="18"/>
               </w:rPr>
-              <w:t>Stopword sensitivity</w:t>
+              <w:t>Scope contrast</w:t>
             </w:r>
           </w:p>
         </w:tc>
@@ -19504,7 +19246,7 @@
                 <w:rFonts w:ascii="Calibri" w:hAnsi="Calibri"/>
                 <w:sz w:val="18"/>
               </w:rPr>
-              <w:t>Stopwords-excluded result minus all-matched result</w:t>
+              <w:t>A descriptive comparison between two explicitly named lexical scopes, such as All lexical tokens and Stopword-excluded; not a separate metric</w:t>
             </w:r>
           </w:p>
         </w:tc>

</xml_diff>